<commit_message>
Update: detailed comments, presentation/report, viva prep, frontend-backend docs
Made-with: Cursor
</commit_message>
<xml_diff>
--- a/TrollGuard_Project_Report.docx
+++ b/TrollGuard_Project_Report.docx
@@ -2,7 +2,7 @@
 <file path=word/document.xml><?xml version="1.0" encoding="utf-8"?>
 <w:document xmlns:w="http://schemas.openxmlformats.org/wordprocessingml/2006/main" xmlns:m="http://schemas.openxmlformats.org/officeDocument/2006/math" xmlns:r="http://schemas.openxmlformats.org/officeDocument/2006/relationships" xmlns:o="urn:schemas-microsoft-com:office:office" xmlns:v="urn:schemas-microsoft-com:vml" xmlns:w10="urn:schemas-microsoft-com:office:word" xmlns:a="http://schemas.openxmlformats.org/drawingml/2006/main" xmlns:pic="http://schemas.openxmlformats.org/drawingml/2006/picture" xmlns:wp="http://schemas.openxmlformats.org/drawingml/2006/wordprocessingDrawing">
   <w:body>
-    <w:bookmarkStart w:id="55" w:name="X181e0e18bc5af0c572c87c6d1fc026263eeac56"/>
+    <w:bookmarkStart w:id="53" w:name="X181e0e18bc5af0c572c87c6d1fc026263eeac56"/>
     <w:p>
       <w:pPr>
         <w:pStyle w:val="Heading1"/>
@@ -933,7 +933,7 @@
         <w:pStyle w:val="BodyText"/>
       </w:pPr>
       <w:r>
-        <w:t xml:space="preserve">The system focuses on short text messages such as comments, tweets, and chat lines. Publicly available labelled datasets are collected and cleaned to remove noise (URLs, emojis, unnecessary symbols). Exploratory Data Analysis (EDA) is performed to understand label distribution, message length, and text characteristics. A baseline classifier is developed using TF-IDF features and Logistic Regression. An optional advanced approach can use contextual sentence representations. The models are evaluated using accuracy, precision, recall, F1-score, and confusion matrix analysis.</w:t>
+        <w:t xml:space="preserve">The system focuses on short text messages such as comments, tweets, and chat lines. Publicly available labelled datasets are collected, augmented, and cleaned to remove noise (URLs, emojis, unnecessary symbols). Exploratory Data Analysis (EDA) is performed to understand label distribution, message length, and text characteristics. A baseline classifier is developed using TF-IDF features and Logistic Regression. The model is evaluated using accuracy, precision, recall, F1-score, and confusion matrix analysis.</w:t>
       </w:r>
     </w:p>
     <w:p>
@@ -941,7 +941,7 @@
         <w:pStyle w:val="BodyText"/>
       </w:pPr>
       <w:r>
-        <w:t xml:space="preserve">Results show that a simple baseline model achieves reasonable performance, while advanced representations can improve sensitivity to subtle bullying. The project demonstrates an end-to-end pipeline that can be extended towards practical moderation tools in educational or organisational settings.</w:t>
+        <w:t xml:space="preserve">Results show that the baseline model achieves reasonable performance (approximately 85–92% accuracy). The Streamlit web application supports single-text prediction, paste bulk analysis, batch CSV upload (up to 10,000 rows with progress bar), and multi-format chat export analysis (WhatsApp, Telegram, Discord) with date filtering, per-sender summaries, and CSV export. The system also includes a Train tab for in-app model retraining with downloadable reports and feature importance. The project demonstrates an end-to-end pipeline suitable for moderation assistance in educational or organisational settings.</w:t>
       </w:r>
     </w:p>
     <w:p>
@@ -992,7 +992,7 @@
         <w:pStyle w:val="BodyText"/>
       </w:pPr>
       <w:r>
-        <w:t xml:space="preserve">Cyberbullying refers to bullying behaviour carried out through digital channels: social media posts, comments, messages, and group chats. It can take the form of direct insults, repeated mocking, threats, exclusion, or indirect remarks that damage a person’s self-esteem and mental health. Manual monitoring of all online communication is unrealistic. TrollGuard is designed as a B.Sc. final year project that addresses this need by demonstrating how text data can be collected, cleaned, analysed, and used to train supervised classification models.</w:t>
+        <w:t xml:space="preserve">Cyberbullying refers to bullying behaviour carried out through digital channels: social media posts, comments, messages, and group chats. It can take the form of direct insults, repeated mocking, threats, exclusion, or indirect remarks that damage a person’s self-esteem and mental health. Manual monitoring of all online communication is unrealistic. TrollGuard is designed as a B.Sc. final year project that addresses this need by demonstrating how text data can be collected, cleaned, augmented, analysed, and used to train supervised classification models, with a Streamlit web interface for predictions and chat analysis.</w:t>
       </w:r>
     </w:p>
     <w:p>
@@ -1141,7 +1141,7 @@
         <w:pStyle w:val="FirstParagraph"/>
       </w:pPr>
       <w:r>
-        <w:t xml:space="preserve">TrollGuard positions itself at the junction between classical and contextual approaches.</w:t>
+        <w:t xml:space="preserve">TrollGuard positions itself at the classical ML approach, with a clear path to more advanced models.</w:t>
       </w:r>
     </w:p>
     <w:bookmarkEnd w:id="18"/>
@@ -1269,7 +1269,7 @@
           <w:b/>
           <w:bCs/>
         </w:rPr>
-        <w:t xml:space="preserve">Python 3.x</w:t>
+        <w:t xml:space="preserve">Python 3.8+</w:t>
       </w:r>
       <w:r>
         <w:t xml:space="preserve"> </w:t>
@@ -1294,13 +1294,13 @@
           <w:b/>
           <w:bCs/>
         </w:rPr>
-        <w:t xml:space="preserve">Google Colab</w:t>
-      </w:r>
-      <w:r>
-        <w:t xml:space="preserve"> </w:t>
-      </w:r>
-      <w:r>
-        <w:t xml:space="preserve">– Cloud notebook (optional)</w:t>
+        <w:t xml:space="preserve">Libraries:</w:t>
+      </w:r>
+      <w:r>
+        <w:t xml:space="preserve"> </w:t>
+      </w:r>
+      <w:r>
+        <w:t xml:space="preserve">pandas (≥1.3.0), numpy (≥1.20.0), scikit-learn (1.7.2), joblib (≥1.1.0), streamlit (≥1.20.0)</w:t>
       </w:r>
       <w:r>
         <w:br/>
@@ -1319,13 +1319,13 @@
           <w:b/>
           <w:bCs/>
         </w:rPr>
-        <w:t xml:space="preserve">Libraries:</w:t>
-      </w:r>
-      <w:r>
-        <w:t xml:space="preserve"> </w:t>
-      </w:r>
-      <w:r>
-        <w:t xml:space="preserve">pandas, numpy, scikit-learn, matplotlib, seaborn, joblib, streamlit</w:t>
+        <w:t xml:space="preserve">Optional:</w:t>
+      </w:r>
+      <w:r>
+        <w:t xml:space="preserve"> </w:t>
+      </w:r>
+      <w:r>
+        <w:t xml:space="preserve">Google Colab, Kaggle API, Hugging Face datasets (for data scripts)</w:t>
       </w:r>
     </w:p>
     <w:bookmarkEnd w:id="22"/>
@@ -1347,7 +1347,31 @@
         </w:numPr>
       </w:pPr>
       <w:r>
-        <w:t xml:space="preserve">Load labelled text datasets (CSV)</w:t>
+        <w:t xml:space="preserve">Load labelled text datasets (CSV) from</w:t>
+      </w:r>
+      <w:r>
+        <w:t xml:space="preserve"> </w:t>
+      </w:r>
+      <w:r>
+        <w:rPr>
+          <w:rStyle w:val="VerbatimChar"/>
+        </w:rPr>
+        <w:t xml:space="preserve">dataset/</w:t>
+      </w:r>
+      <w:r>
+        <w:t xml:space="preserve"> </w:t>
+      </w:r>
+      <w:r>
+        <w:t xml:space="preserve">or</w:t>
+      </w:r>
+      <w:r>
+        <w:t xml:space="preserve"> </w:t>
+      </w:r>
+      <w:r>
+        <w:rPr>
+          <w:rStyle w:val="VerbatimChar"/>
+        </w:rPr>
+        <w:t xml:space="preserve">datasets/</w:t>
       </w:r>
       <w:r>
         <w:br/>
@@ -1362,7 +1386,16 @@
         </w:numPr>
       </w:pPr>
       <w:r>
-        <w:t xml:space="preserve">Preprocess and clean text</w:t>
+        <w:t xml:space="preserve">Preprocess and clean text (lowercase, remove URLs,</w:t>
+      </w:r>
+      <w:r>
+        <w:t xml:space="preserve"> </w:t>
+      </w:r>
+      <w:r>
+        <w:t xml:space="preserve">@mentions</w:t>
+      </w:r>
+      <w:r>
+        <w:t xml:space="preserve">, #hashtags)</w:t>
       </w:r>
       <w:r>
         <w:br/>
@@ -1407,7 +1440,7 @@
         </w:numPr>
       </w:pPr>
       <w:r>
-        <w:t xml:space="preserve">Evaluate using standard metrics</w:t>
+        <w:t xml:space="preserve">Evaluate using accuracy, precision, recall, F1, confusion matrix</w:t>
       </w:r>
       <w:r>
         <w:br/>
@@ -1422,7 +1455,7 @@
         </w:numPr>
       </w:pPr>
       <w:r>
-        <w:t xml:space="preserve">Support single-text and batch prediction</w:t>
+        <w:t xml:space="preserve">Support single-text, paste-text bulk analysis, and batch CSV prediction (progress bar, 10K row limit)</w:t>
       </w:r>
       <w:r>
         <w:br/>
@@ -1437,7 +1470,136 @@
         </w:numPr>
       </w:pPr>
       <w:r>
-        <w:t xml:space="preserve">Parse WhatsApp-style chat exports and analyse per-sender</w:t>
+        <w:t xml:space="preserve">Parse multi-format chat exports (WhatsApp, Telegram, Discord) via upload or paste; format auto-detect</w:t>
+      </w:r>
+      <w:r>
+        <w:br/>
+      </w:r>
+    </w:p>
+    <w:p>
+      <w:pPr>
+        <w:pStyle w:val="Compact"/>
+        <w:numPr>
+          <w:ilvl w:val="0"/>
+          <w:numId w:val="1004"/>
+        </w:numPr>
+      </w:pPr>
+      <w:r>
+        <w:t xml:space="preserve">Optional date filter for chat analysis</w:t>
+      </w:r>
+      <w:r>
+        <w:br/>
+      </w:r>
+    </w:p>
+    <w:p>
+      <w:pPr>
+        <w:pStyle w:val="Compact"/>
+        <w:numPr>
+          <w:ilvl w:val="0"/>
+          <w:numId w:val="1004"/>
+        </w:numPr>
+      </w:pPr>
+      <w:r>
+        <w:t xml:space="preserve">Per-sender summary (total messages, flagged count, flagged %)</w:t>
+      </w:r>
+      <w:r>
+        <w:br/>
+      </w:r>
+    </w:p>
+    <w:p>
+      <w:pPr>
+        <w:pStyle w:val="Compact"/>
+        <w:numPr>
+          <w:ilvl w:val="0"/>
+          <w:numId w:val="1004"/>
+        </w:numPr>
+      </w:pPr>
+      <w:r>
+        <w:t xml:space="preserve">Export chat analysis and training reports to CSV</w:t>
+      </w:r>
+      <w:r>
+        <w:br/>
+      </w:r>
+    </w:p>
+    <w:p>
+      <w:pPr>
+        <w:pStyle w:val="Compact"/>
+        <w:numPr>
+          <w:ilvl w:val="0"/>
+          <w:numId w:val="1004"/>
+        </w:numPr>
+      </w:pPr>
+      <w:r>
+        <w:t xml:space="preserve">Display feature importance (top bullying/safe words) in sidebar and Train tab</w:t>
+      </w:r>
+      <w:r>
+        <w:br/>
+      </w:r>
+    </w:p>
+    <w:p>
+      <w:pPr>
+        <w:pStyle w:val="Compact"/>
+        <w:numPr>
+          <w:ilvl w:val="0"/>
+          <w:numId w:val="1004"/>
+        </w:numPr>
+      </w:pPr>
+      <w:r>
+        <w:t xml:space="preserve">Session statistics (predictions, flagged count) in sidebar</w:t>
+      </w:r>
+      <w:r>
+        <w:br/>
+      </w:r>
+    </w:p>
+    <w:p>
+      <w:pPr>
+        <w:pStyle w:val="Compact"/>
+        <w:numPr>
+          <w:ilvl w:val="0"/>
+          <w:numId w:val="1004"/>
+        </w:numPr>
+      </w:pPr>
+      <w:r>
+        <w:t xml:space="preserve">Deploy on Streamlit Cloud with lazy model loading</w:t>
+      </w:r>
+      <w:r>
+        <w:br/>
+      </w:r>
+    </w:p>
+    <w:p>
+      <w:pPr>
+        <w:pStyle w:val="Compact"/>
+        <w:numPr>
+          <w:ilvl w:val="0"/>
+          <w:numId w:val="1004"/>
+        </w:numPr>
+      </w:pPr>
+      <w:r>
+        <w:t xml:space="preserve">Retrain model from app or via</w:t>
+      </w:r>
+      <w:r>
+        <w:t xml:space="preserve"> </w:t>
+      </w:r>
+      <w:r>
+        <w:rPr>
+          <w:rStyle w:val="VerbatimChar"/>
+        </w:rPr>
+        <w:t xml:space="preserve">train_model.py</w:t>
+      </w:r>
+      <w:r>
+        <w:t xml:space="preserve"> </w:t>
+      </w:r>
+      <w:r>
+        <w:t xml:space="preserve">/</w:t>
+      </w:r>
+      <w:r>
+        <w:t xml:space="preserve"> </w:t>
+      </w:r>
+      <w:r>
+        <w:rPr>
+          <w:rStyle w:val="VerbatimChar"/>
+        </w:rPr>
+        <w:t xml:space="preserve">scripts/train_and_save.py</w:t>
       </w:r>
     </w:p>
     <w:p>
@@ -1449,7 +1611,7 @@
     </w:p>
     <w:bookmarkEnd w:id="23"/>
     <w:bookmarkEnd w:id="24"/>
-    <w:bookmarkStart w:id="28" w:name="chapter-4-design"/>
+    <w:bookmarkStart w:id="30" w:name="chapter-4-design"/>
     <w:p>
       <w:pPr>
         <w:pStyle w:val="Heading2"/>
@@ -1537,7 +1699,7 @@
         <w:t xml:space="preserve"> </w:t>
       </w:r>
       <w:r>
-        <w:t xml:space="preserve">columns</w:t>
+        <w:t xml:space="preserve">columns; or chat text (upload/paste)</w:t>
       </w:r>
       <w:r>
         <w:br/>
@@ -1587,7 +1749,7 @@
         <w:t xml:space="preserve"> </w:t>
       </w:r>
       <w:r>
-        <w:t xml:space="preserve">TF-IDF with n-grams (1, 2)</w:t>
+        <w:t xml:space="preserve">TF-IDF with n-grams (1, 2), min_df=2, max_df=0.95</w:t>
       </w:r>
       <w:r>
         <w:br/>
@@ -1612,7 +1774,7 @@
         <w:t xml:space="preserve"> </w:t>
       </w:r>
       <w:r>
-        <w:t xml:space="preserve">Logistic Regression</w:t>
+        <w:t xml:space="preserve">Logistic Regression (max_iter=300)</w:t>
       </w:r>
       <w:r>
         <w:br/>
@@ -1658,7 +1820,339 @@
         <w:rPr>
           <w:rStyle w:val="VerbatimChar"/>
         </w:rPr>
-        <w:t xml:space="preserve">WhatsApp export (.txt) → Parse (timestamp, sender, message) → Clean → Predict → Aggregate per sender</w:t>
+        <w:t xml:space="preserve">Upload / Paste chat (.txt) → Format selector (WhatsApp/Telegram/Discord/Auto) → Parse (timestamp, sender, message) → Optional date filter → Clean → Predict → Aggregate per sender → Export CSV</w:t>
+      </w:r>
+    </w:p>
+    <w:p>
+      <w:pPr>
+        <w:pStyle w:val="FirstParagraph"/>
+      </w:pPr>
+      <w:r>
+        <w:rPr>
+          <w:b/>
+          <w:bCs/>
+        </w:rPr>
+        <w:t xml:space="preserve">Chat formats supported:</w:t>
+      </w:r>
+      <w:r>
+        <w:t xml:space="preserve"> </w:t>
+      </w:r>
+      <w:r>
+        <w:t xml:space="preserve">-</w:t>
+      </w:r>
+      <w:r>
+        <w:t xml:space="preserve"> </w:t>
+      </w:r>
+      <w:r>
+        <w:rPr>
+          <w:b/>
+          <w:bCs/>
+        </w:rPr>
+        <w:t xml:space="preserve">WhatsApp:</w:t>
+      </w:r>
+      <w:r>
+        <w:t xml:space="preserve"> </w:t>
+      </w:r>
+      <w:r>
+        <w:rPr>
+          <w:rStyle w:val="VerbatimChar"/>
+        </w:rPr>
+        <w:t xml:space="preserve">DD/MM/YYYY, HH:MM - Sender: message</w:t>
+      </w:r>
+      <w:r>
+        <w:br/>
+      </w:r>
+      <w:r>
+        <w:t xml:space="preserve">-</w:t>
+      </w:r>
+      <w:r>
+        <w:t xml:space="preserve"> </w:t>
+      </w:r>
+      <w:r>
+        <w:rPr>
+          <w:b/>
+          <w:bCs/>
+        </w:rPr>
+        <w:t xml:space="preserve">Telegram:</w:t>
+      </w:r>
+      <w:r>
+        <w:t xml:space="preserve"> </w:t>
+      </w:r>
+      <w:r>
+        <w:rPr>
+          <w:rStyle w:val="VerbatimChar"/>
+        </w:rPr>
+        <w:t xml:space="preserve">DD.MM.YYYY, HH:MM - Sender: message</w:t>
+      </w:r>
+      <w:r>
+        <w:t xml:space="preserve"> </w:t>
+      </w:r>
+      <w:r>
+        <w:t xml:space="preserve">(dots converted to slashes)</w:t>
+      </w:r>
+      <w:r>
+        <w:br/>
+      </w:r>
+      <w:r>
+        <w:t xml:space="preserve">-</w:t>
+      </w:r>
+      <w:r>
+        <w:t xml:space="preserve"> </w:t>
+      </w:r>
+      <w:r>
+        <w:rPr>
+          <w:b/>
+          <w:bCs/>
+        </w:rPr>
+        <w:t xml:space="preserve">Discord:</w:t>
+      </w:r>
+      <w:r>
+        <w:t xml:space="preserve"> </w:t>
+      </w:r>
+      <w:r>
+        <w:rPr>
+          <w:rStyle w:val="VerbatimChar"/>
+        </w:rPr>
+        <w:t xml:space="preserve">[DD/MM/YYYY HH:MM] Sender: message</w:t>
+      </w:r>
+    </w:p>
+    <w:p>
+      <w:pPr>
+        <w:pStyle w:val="BodyText"/>
+      </w:pPr>
+      <w:r>
+        <w:t xml:space="preserve">Malformed lines are kept with sender=</w:t>
+      </w:r>
+      <w:r>
+        <w:t xml:space="preserve">“Unknown”</w:t>
+      </w:r>
+      <w:r>
+        <w:t xml:space="preserve">, timestamp=1970-01-01.</w:t>
+      </w:r>
+    </w:p>
+    <w:bookmarkEnd w:id="27"/>
+    <w:bookmarkStart w:id="28" w:name="configuration-limits"/>
+    <w:p>
+      <w:pPr>
+        <w:pStyle w:val="Heading3"/>
+      </w:pPr>
+      <w:r>
+        <w:t xml:space="preserve">4.4 Configuration Limits</w:t>
+      </w:r>
+    </w:p>
+    <w:p>
+      <w:pPr>
+        <w:pStyle w:val="Compact"/>
+        <w:numPr>
+          <w:ilvl w:val="0"/>
+          <w:numId w:val="1006"/>
+        </w:numPr>
+      </w:pPr>
+      <w:r>
+        <w:rPr>
+          <w:b/>
+          <w:bCs/>
+        </w:rPr>
+        <w:t xml:space="preserve">MAX_INPUT_CHARS:</w:t>
+      </w:r>
+      <w:r>
+        <w:t xml:space="preserve"> </w:t>
+      </w:r>
+      <w:r>
+        <w:t xml:space="preserve">50,000 characters per text area / paste / upload</w:t>
+      </w:r>
+      <w:r>
+        <w:br/>
+      </w:r>
+    </w:p>
+    <w:p>
+      <w:pPr>
+        <w:pStyle w:val="Compact"/>
+        <w:numPr>
+          <w:ilvl w:val="0"/>
+          <w:numId w:val="1006"/>
+        </w:numPr>
+      </w:pPr>
+      <w:r>
+        <w:rPr>
+          <w:b/>
+          <w:bCs/>
+        </w:rPr>
+        <w:t xml:space="preserve">BATCH_CSV_LIMIT:</w:t>
+      </w:r>
+      <w:r>
+        <w:t xml:space="preserve"> </w:t>
+      </w:r>
+      <w:r>
+        <w:t xml:space="preserve">10,000 rows per batch CSV</w:t>
+      </w:r>
+    </w:p>
+    <w:bookmarkEnd w:id="28"/>
+    <w:bookmarkStart w:id="29" w:name="deployment"/>
+    <w:p>
+      <w:pPr>
+        <w:pStyle w:val="Heading3"/>
+      </w:pPr>
+      <w:r>
+        <w:t xml:space="preserve">4.5 Deployment</w:t>
+      </w:r>
+    </w:p>
+    <w:p>
+      <w:pPr>
+        <w:pStyle w:val="Compact"/>
+        <w:numPr>
+          <w:ilvl w:val="0"/>
+          <w:numId w:val="1007"/>
+        </w:numPr>
+      </w:pPr>
+      <w:r>
+        <w:rPr>
+          <w:b/>
+          <w:bCs/>
+        </w:rPr>
+        <w:t xml:space="preserve">Streamlit Cloud:</w:t>
+      </w:r>
+      <w:r>
+        <w:t xml:space="preserve"> </w:t>
+      </w:r>
+      <w:r>
+        <w:t xml:space="preserve">App URL: https://trollguard-eem9mwmcp2gtqwff95wu7v.streamlit.app/</w:t>
+      </w:r>
+      <w:r>
+        <w:br/>
+      </w:r>
+    </w:p>
+    <w:p>
+      <w:pPr>
+        <w:pStyle w:val="Compact"/>
+        <w:numPr>
+          <w:ilvl w:val="0"/>
+          <w:numId w:val="1007"/>
+        </w:numPr>
+      </w:pPr>
+      <w:r>
+        <w:rPr>
+          <w:b/>
+          <w:bCs/>
+        </w:rPr>
+        <w:t xml:space="preserve">GitHub:</w:t>
+      </w:r>
+      <w:r>
+        <w:t xml:space="preserve"> </w:t>
+      </w:r>
+      <w:r>
+        <w:t xml:space="preserve">https://github.com/itsmehari/TrollGuard</w:t>
+      </w:r>
+      <w:r>
+        <w:br/>
+      </w:r>
+    </w:p>
+    <w:p>
+      <w:pPr>
+        <w:pStyle w:val="Compact"/>
+        <w:numPr>
+          <w:ilvl w:val="0"/>
+          <w:numId w:val="1007"/>
+        </w:numPr>
+      </w:pPr>
+      <w:r>
+        <w:rPr>
+          <w:b/>
+          <w:bCs/>
+        </w:rPr>
+        <w:t xml:space="preserve">Main file:</w:t>
+      </w:r>
+      <w:r>
+        <w:t xml:space="preserve"> </w:t>
+      </w:r>
+      <w:r>
+        <w:rPr>
+          <w:rStyle w:val="VerbatimChar"/>
+        </w:rPr>
+        <w:t xml:space="preserve">code/app.py</w:t>
+      </w:r>
+      <w:r>
+        <w:br/>
+      </w:r>
+    </w:p>
+    <w:p>
+      <w:pPr>
+        <w:pStyle w:val="Compact"/>
+        <w:numPr>
+          <w:ilvl w:val="0"/>
+          <w:numId w:val="1007"/>
+        </w:numPr>
+      </w:pPr>
+      <w:r>
+        <w:rPr>
+          <w:b/>
+          <w:bCs/>
+        </w:rPr>
+        <w:t xml:space="preserve">Theme:</w:t>
+      </w:r>
+      <w:r>
+        <w:t xml:space="preserve"> </w:t>
+      </w:r>
+      <w:r>
+        <w:t xml:space="preserve">Light (</w:t>
+      </w:r>
+      <w:r>
+        <w:rPr>
+          <w:rStyle w:val="VerbatimChar"/>
+        </w:rPr>
+        <w:t xml:space="preserve">.streamlit/config.toml</w:t>
+      </w:r>
+      <w:r>
+        <w:t xml:space="preserve">)</w:t>
+      </w:r>
+      <w:r>
+        <w:br/>
+      </w:r>
+    </w:p>
+    <w:p>
+      <w:pPr>
+        <w:pStyle w:val="Compact"/>
+        <w:numPr>
+          <w:ilvl w:val="0"/>
+          <w:numId w:val="1007"/>
+        </w:numPr>
+      </w:pPr>
+      <w:r>
+        <w:rPr>
+          <w:b/>
+          <w:bCs/>
+        </w:rPr>
+        <w:t xml:space="preserve">Model storage:</w:t>
+      </w:r>
+      <w:r>
+        <w:t xml:space="preserve"> </w:t>
+      </w:r>
+      <w:r>
+        <w:rPr>
+          <w:rStyle w:val="VerbatimChar"/>
+        </w:rPr>
+        <w:t xml:space="preserve">models/</w:t>
+      </w:r>
+      <w:r>
+        <w:t xml:space="preserve"> </w:t>
+      </w:r>
+      <w:r>
+        <w:t xml:space="preserve">(primary) or</w:t>
+      </w:r>
+      <w:r>
+        <w:t xml:space="preserve"> </w:t>
+      </w:r>
+      <w:r>
+        <w:rPr>
+          <w:rStyle w:val="VerbatimChar"/>
+        </w:rPr>
+        <w:t xml:space="preserve">outputs/</w:t>
+      </w:r>
+      <w:r>
+        <w:t xml:space="preserve"> </w:t>
+      </w:r>
+      <w:r>
+        <w:t xml:space="preserve">(fallback)</w:t>
       </w:r>
     </w:p>
     <w:p>
@@ -1668,9 +2162,9 @@
         </w:pict>
       </w:r>
     </w:p>
-    <w:bookmarkEnd w:id="27"/>
-    <w:bookmarkEnd w:id="28"/>
-    <w:bookmarkStart w:id="29" w:name="chapter-5-modules"/>
+    <w:bookmarkEnd w:id="29"/>
+    <w:bookmarkEnd w:id="30"/>
+    <w:bookmarkStart w:id="31" w:name="chapter-5-modules"/>
     <w:p>
       <w:pPr>
         <w:pStyle w:val="Heading2"/>
@@ -1740,7 +2234,16 @@
               <w:pStyle w:val="Compact"/>
             </w:pPr>
             <w:r>
-              <w:t xml:space="preserve">Loads</w:t>
+              <w:rPr>
+                <w:rStyle w:val="VerbatimChar"/>
+              </w:rPr>
+              <w:t xml:space="preserve">core/data_loader.py</w:t>
+            </w:r>
+            <w:r>
+              <w:t xml:space="preserve"> </w:t>
+            </w:r>
+            <w:r>
+              <w:t xml:space="preserve">– Loads</w:t>
             </w:r>
             <w:r>
               <w:t xml:space="preserve"> </w:t>
@@ -1752,10 +2255,49 @@
               <w:t xml:space="preserve">*_parsed_dataset.csv</w:t>
             </w:r>
             <w:r>
+              <w:t xml:space="preserve">; normalises labels; supports</w:t>
+            </w:r>
+            <w:r>
               <w:t xml:space="preserve"> </w:t>
             </w:r>
             <w:r>
-              <w:t xml:space="preserve">files, normalises labels to binary</w:t>
+              <w:rPr>
+                <w:rStyle w:val="VerbatimChar"/>
+              </w:rPr>
+              <w:t xml:space="preserve">datasets/</w:t>
+            </w:r>
+            <w:r>
+              <w:t xml:space="preserve"> </w:t>
+            </w:r>
+            <w:r>
+              <w:t xml:space="preserve">and</w:t>
+            </w:r>
+            <w:r>
+              <w:t xml:space="preserve"> </w:t>
+            </w:r>
+            <w:r>
+              <w:rPr>
+                <w:rStyle w:val="VerbatimChar"/>
+              </w:rPr>
+              <w:t xml:space="preserve">dataset/</w:t>
+            </w:r>
+            <w:r>
+              <w:t xml:space="preserve">;</w:t>
+            </w:r>
+            <w:r>
+              <w:t xml:space="preserve"> </w:t>
+            </w:r>
+            <w:r>
+              <w:rPr>
+                <w:rStyle w:val="VerbatimChar"/>
+              </w:rPr>
+              <w:t xml:space="preserve">get_sample_fallback()</w:t>
+            </w:r>
+            <w:r>
+              <w:t xml:space="preserve"> </w:t>
+            </w:r>
+            <w:r>
+              <w:t xml:space="preserve">when no CSVs</w:t>
             </w:r>
           </w:p>
         </w:tc>
@@ -1783,7 +2325,28 @@
               <w:pStyle w:val="Compact"/>
             </w:pPr>
             <w:r>
-              <w:t xml:space="preserve">Lowercase, remove URLs,</w:t>
+              <w:rPr>
+                <w:rStyle w:val="VerbatimChar"/>
+              </w:rPr>
+              <w:t xml:space="preserve">core/model_utils.py</w:t>
+            </w:r>
+            <w:r>
+              <w:t xml:space="preserve"> </w:t>
+            </w:r>
+            <w:r>
+              <w:t xml:space="preserve">–</w:t>
+            </w:r>
+            <w:r>
+              <w:t xml:space="preserve"> </w:t>
+            </w:r>
+            <w:r>
+              <w:rPr>
+                <w:rStyle w:val="VerbatimChar"/>
+              </w:rPr>
+              <w:t xml:space="preserve">clean_text()</w:t>
+            </w:r>
+            <w:r>
+              <w:t xml:space="preserve">: lowercase, remove URLs,</w:t>
             </w:r>
             <w:r>
               <w:t xml:space="preserve"> </w:t>
@@ -1809,7 +2372,7 @@
                 <w:b/>
                 <w:bCs/>
               </w:rPr>
-              <w:t xml:space="preserve">EDA</w:t>
+              <w:t xml:space="preserve">Chat Parser</w:t>
             </w:r>
           </w:p>
         </w:tc>
@@ -1820,7 +2383,43 @@
               <w:pStyle w:val="Compact"/>
             </w:pPr>
             <w:r>
-              <w:t xml:space="preserve">Class distribution, text length histogram, basic statistics</w:t>
+              <w:rPr>
+                <w:rStyle w:val="VerbatimChar"/>
+              </w:rPr>
+              <w:t xml:space="preserve">core/chat_parser.py</w:t>
+            </w:r>
+            <w:r>
+              <w:t xml:space="preserve"> </w:t>
+            </w:r>
+            <w:r>
+              <w:t xml:space="preserve">–</w:t>
+            </w:r>
+            <w:r>
+              <w:t xml:space="preserve"> </w:t>
+            </w:r>
+            <w:r>
+              <w:rPr>
+                <w:rStyle w:val="VerbatimChar"/>
+              </w:rPr>
+              <w:t xml:space="preserve">parse_chat_from_string()</w:t>
+            </w:r>
+            <w:r>
+              <w:t xml:space="preserve"> </w:t>
+            </w:r>
+            <w:r>
+              <w:t xml:space="preserve">for WhatsApp, Telegram, Discord;</w:t>
+            </w:r>
+            <w:r>
+              <w:t xml:space="preserve"> </w:t>
+            </w:r>
+            <w:r>
+              <w:rPr>
+                <w:rStyle w:val="VerbatimChar"/>
+              </w:rPr>
+              <w:t xml:space="preserve">format_hint</w:t>
+            </w:r>
+            <w:r>
+              <w:t xml:space="preserve">: auto/whatsapp/telegram/discord; malformed lines → Unknown</w:t>
             </w:r>
           </w:p>
         </w:tc>
@@ -1837,7 +2436,7 @@
                 <w:b/>
                 <w:bCs/>
               </w:rPr>
-              <w:t xml:space="preserve">Feature Engineering</w:t>
+              <w:t xml:space="preserve">EDA</w:t>
             </w:r>
           </w:p>
         </w:tc>
@@ -1848,7 +2447,7 @@
               <w:pStyle w:val="Compact"/>
             </w:pPr>
             <w:r>
-              <w:t xml:space="preserve">TF-IDF vectorisation (ngram_range=(1,2), min_df=2, max_df=0.95)</w:t>
+              <w:t xml:space="preserve">Class distribution, text length histogram, dataset stats</w:t>
             </w:r>
           </w:p>
         </w:tc>
@@ -1865,7 +2464,7 @@
                 <w:b/>
                 <w:bCs/>
               </w:rPr>
-              <w:t xml:space="preserve">Model Training</w:t>
+              <w:t xml:space="preserve">Feature Engineering</w:t>
             </w:r>
           </w:p>
         </w:tc>
@@ -1876,7 +2475,7 @@
               <w:pStyle w:val="Compact"/>
             </w:pPr>
             <w:r>
-              <w:t xml:space="preserve">Logistic Regression (max_iter=300)</w:t>
+              <w:t xml:space="preserve">TF-IDF (ngram_range=(1,2), min_df=2, max_df=0.95)</w:t>
             </w:r>
           </w:p>
         </w:tc>
@@ -1893,7 +2492,7 @@
                 <w:b/>
                 <w:bCs/>
               </w:rPr>
-              <w:t xml:space="preserve">Evaluation</w:t>
+              <w:t xml:space="preserve">Model Training</w:t>
             </w:r>
           </w:p>
         </w:tc>
@@ -1904,7 +2503,28 @@
               <w:pStyle w:val="Compact"/>
             </w:pPr>
             <w:r>
-              <w:t xml:space="preserve">Accuracy, classification report, confusion matrix</w:t>
+              <w:t xml:space="preserve">Logistic Regression (max_iter=300);</w:t>
+            </w:r>
+            <w:r>
+              <w:t xml:space="preserve"> </w:t>
+            </w:r>
+            <w:r>
+              <w:rPr>
+                <w:rStyle w:val="VerbatimChar"/>
+              </w:rPr>
+              <w:t xml:space="preserve">train_model.py</w:t>
+            </w:r>
+            <w:r>
+              <w:t xml:space="preserve">,</w:t>
+            </w:r>
+            <w:r>
+              <w:t xml:space="preserve"> </w:t>
+            </w:r>
+            <w:r>
+              <w:rPr>
+                <w:rStyle w:val="VerbatimChar"/>
+              </w:rPr>
+              <w:t xml:space="preserve">scripts/train_and_save.py</w:t>
             </w:r>
           </w:p>
         </w:tc>
@@ -1921,7 +2541,7 @@
                 <w:b/>
                 <w:bCs/>
               </w:rPr>
-              <w:t xml:space="preserve">Prediction</w:t>
+              <w:t xml:space="preserve">Feature Importance</w:t>
             </w:r>
           </w:p>
         </w:tc>
@@ -1932,7 +2552,16 @@
               <w:pStyle w:val="Compact"/>
             </w:pPr>
             <w:r>
-              <w:t xml:space="preserve">Single text, batch CSV, chat export analysis</w:t>
+              <w:rPr>
+                <w:rStyle w:val="VerbatimChar"/>
+              </w:rPr>
+              <w:t xml:space="preserve">get_top_words()</w:t>
+            </w:r>
+            <w:r>
+              <w:t xml:space="preserve"> </w:t>
+            </w:r>
+            <w:r>
+              <w:t xml:space="preserve">– top bullying/safe words from coefficients; guards against vocab/coef length mismatch</w:t>
             </w:r>
           </w:p>
         </w:tc>
@@ -1949,7 +2578,7 @@
                 <w:b/>
                 <w:bCs/>
               </w:rPr>
-              <w:t xml:space="preserve">Streamlit App</w:t>
+              <w:t xml:space="preserve">Evaluation</w:t>
             </w:r>
           </w:p>
         </w:tc>
@@ -1960,7 +2589,145 @@
               <w:pStyle w:val="Compact"/>
             </w:pPr>
             <w:r>
-              <w:t xml:space="preserve">Web UI for prediction, chat analysis, and training</w:t>
+              <w:t xml:space="preserve">Accuracy, classification report, confusion matrix; downloadable reports</w:t>
+            </w:r>
+          </w:p>
+        </w:tc>
+      </w:tr>
+      <w:tr>
+        <w:tc>
+          <w:tcPr/>
+          <w:p>
+            <w:pPr>
+              <w:pStyle w:val="Compact"/>
+            </w:pPr>
+            <w:r>
+              <w:rPr>
+                <w:b/>
+                <w:bCs/>
+              </w:rPr>
+              <w:t xml:space="preserve">Prediction</w:t>
+            </w:r>
+          </w:p>
+        </w:tc>
+        <w:tc>
+          <w:tcPr/>
+          <w:p>
+            <w:pPr>
+              <w:pStyle w:val="Compact"/>
+            </w:pPr>
+            <w:r>
+              <w:t xml:space="preserve">Single text, paste bulk, batch CSV (progress bar); chat analysis with date filter, per-sender summary, CSV export</w:t>
+            </w:r>
+          </w:p>
+        </w:tc>
+      </w:tr>
+      <w:tr>
+        <w:tc>
+          <w:tcPr/>
+          <w:p>
+            <w:pPr>
+              <w:pStyle w:val="Compact"/>
+            </w:pPr>
+            <w:r>
+              <w:rPr>
+                <w:b/>
+                <w:bCs/>
+              </w:rPr>
+              <w:t xml:space="preserve">Streamlit App</w:t>
+            </w:r>
+          </w:p>
+        </w:tc>
+        <w:tc>
+          <w:tcPr/>
+          <w:p>
+            <w:pPr>
+              <w:pStyle w:val="Compact"/>
+            </w:pPr>
+            <w:r>
+              <w:t xml:space="preserve">Tabs: Predict, Chat analysis, Train model, About; sidebar: model status, session stats, feature importance, datasets</w:t>
+            </w:r>
+          </w:p>
+        </w:tc>
+      </w:tr>
+      <w:tr>
+        <w:tc>
+          <w:tcPr/>
+          <w:p>
+            <w:pPr>
+              <w:pStyle w:val="Compact"/>
+            </w:pPr>
+            <w:r>
+              <w:rPr>
+                <w:b/>
+                <w:bCs/>
+              </w:rPr>
+              <w:t xml:space="preserve">Scripts</w:t>
+            </w:r>
+          </w:p>
+        </w:tc>
+        <w:tc>
+          <w:tcPr/>
+          <w:p>
+            <w:pPr>
+              <w:pStyle w:val="Compact"/>
+            </w:pPr>
+            <w:r>
+              <w:rPr>
+                <w:rStyle w:val="VerbatimChar"/>
+              </w:rPr>
+              <w:t xml:space="preserve">augment_data.py</w:t>
+            </w:r>
+            <w:r>
+              <w:t xml:space="preserve"> </w:t>
+            </w:r>
+            <w:r>
+              <w:t xml:space="preserve">(synonym/swap augmentation),</w:t>
+            </w:r>
+            <w:r>
+              <w:t xml:space="preserve"> </w:t>
+            </w:r>
+            <w:r>
+              <w:rPr>
+                <w:rStyle w:val="VerbatimChar"/>
+              </w:rPr>
+              <w:t xml:space="preserve">generate_synthetic_data.py</w:t>
+            </w:r>
+            <w:r>
+              <w:t xml:space="preserve"> </w:t>
+            </w:r>
+            <w:r>
+              <w:t xml:space="preserve">(template-based),</w:t>
+            </w:r>
+            <w:r>
+              <w:t xml:space="preserve"> </w:t>
+            </w:r>
+            <w:r>
+              <w:rPr>
+                <w:rStyle w:val="VerbatimChar"/>
+              </w:rPr>
+              <w:t xml:space="preserve">download_datasets.py</w:t>
+            </w:r>
+            <w:r>
+              <w:t xml:space="preserve"> </w:t>
+            </w:r>
+            <w:r>
+              <w:t xml:space="preserve">(Kaggle, Hugging Face),</w:t>
+            </w:r>
+            <w:r>
+              <w:t xml:space="preserve"> </w:t>
+            </w:r>
+            <w:r>
+              <w:rPr>
+                <w:rStyle w:val="VerbatimChar"/>
+              </w:rPr>
+              <w:t xml:space="preserve">train_and_save.py</w:t>
+            </w:r>
+            <w:r>
+              <w:t xml:space="preserve"> </w:t>
+            </w:r>
+            <w:r>
+              <w:t xml:space="preserve">(retrain for sklearn version compatibility)</w:t>
             </w:r>
           </w:p>
         </w:tc>
@@ -1973,8 +2740,8 @@
         </w:pict>
       </w:r>
     </w:p>
-    <w:bookmarkEnd w:id="29"/>
-    <w:bookmarkStart w:id="33" w:name="chapter-6-implementation"/>
+    <w:bookmarkEnd w:id="31"/>
+    <w:bookmarkStart w:id="35" w:name="chapter-6-implementation"/>
     <w:p>
       <w:pPr>
         <w:pStyle w:val="Heading2"/>
@@ -1983,7 +2750,7 @@
         <w:t xml:space="preserve">Chapter 6 – Implementation</w:t>
       </w:r>
     </w:p>
-    <w:bookmarkStart w:id="30" w:name="core-implementation"/>
+    <w:bookmarkStart w:id="32" w:name="core-implementation"/>
     <w:p>
       <w:pPr>
         <w:pStyle w:val="Heading3"/>
@@ -1997,7 +2764,7 @@
         <w:pStyle w:val="Compact"/>
         <w:numPr>
           <w:ilvl w:val="0"/>
-          <w:numId w:val="1006"/>
+          <w:numId w:val="1008"/>
         </w:numPr>
       </w:pPr>
       <w:r>
@@ -2020,7 +2787,7 @@
         <w:t xml:space="preserve"> </w:t>
       </w:r>
       <w:r>
-        <w:t xml:space="preserve">– loads all</w:t>
+        <w:t xml:space="preserve">–</w:t>
       </w:r>
       <w:r>
         <w:t xml:space="preserve"> </w:t>
@@ -2029,24 +2796,57 @@
         <w:rPr>
           <w:rStyle w:val="VerbatimChar"/>
         </w:rPr>
-        <w:t xml:space="preserve">*_parsed_dataset.csv</w:t>
-      </w:r>
-      <w:r>
-        <w:t xml:space="preserve"> </w:t>
-      </w:r>
-      <w:r>
-        <w:t xml:space="preserve">files</w:t>
-      </w:r>
-      <w:r>
-        <w:br/>
-      </w:r>
-    </w:p>
-    <w:p>
-      <w:pPr>
-        <w:pStyle w:val="Compact"/>
-        <w:numPr>
-          <w:ilvl w:val="0"/>
-          <w:numId w:val="1006"/>
+        <w:t xml:space="preserve">load_parsed_datasets()</w:t>
+      </w:r>
+      <w:r>
+        <w:t xml:space="preserve">,</w:t>
+      </w:r>
+      <w:r>
+        <w:t xml:space="preserve"> </w:t>
+      </w:r>
+      <w:r>
+        <w:rPr>
+          <w:rStyle w:val="VerbatimChar"/>
+        </w:rPr>
+        <w:t xml:space="preserve">get_datasets_dir()</w:t>
+      </w:r>
+      <w:r>
+        <w:t xml:space="preserve">,</w:t>
+      </w:r>
+      <w:r>
+        <w:t xml:space="preserve"> </w:t>
+      </w:r>
+      <w:r>
+        <w:rPr>
+          <w:rStyle w:val="VerbatimChar"/>
+        </w:rPr>
+        <w:t xml:space="preserve">get_project_root()</w:t>
+      </w:r>
+      <w:r>
+        <w:t xml:space="preserve"> </w:t>
+      </w:r>
+      <w:r>
+        <w:t xml:space="preserve">(Colab/Drive/local),</w:t>
+      </w:r>
+      <w:r>
+        <w:t xml:space="preserve"> </w:t>
+      </w:r>
+      <w:r>
+        <w:rPr>
+          <w:rStyle w:val="VerbatimChar"/>
+        </w:rPr>
+        <w:t xml:space="preserve">get_sample_fallback()</w:t>
+      </w:r>
+      <w:r>
+        <w:br/>
+      </w:r>
+    </w:p>
+    <w:p>
+      <w:pPr>
+        <w:pStyle w:val="Compact"/>
+        <w:numPr>
+          <w:ilvl w:val="0"/>
+          <w:numId w:val="1008"/>
         </w:numPr>
       </w:pPr>
       <w:r>
@@ -2090,6 +2890,18 @@
         <w:rPr>
           <w:rStyle w:val="VerbatimChar"/>
         </w:rPr>
+        <w:t xml:space="preserve">load_model_and_vectoriser</w:t>
+      </w:r>
+      <w:r>
+        <w:t xml:space="preserve">,</w:t>
+      </w:r>
+      <w:r>
+        <w:t xml:space="preserve"> </w:t>
+      </w:r>
+      <w:r>
+        <w:rPr>
+          <w:rStyle w:val="VerbatimChar"/>
+        </w:rPr>
         <w:t xml:space="preserve">predict_text</w:t>
       </w:r>
       <w:r>
@@ -2105,15 +2917,39 @@
         <w:t xml:space="preserve">predict_batch</w:t>
       </w:r>
       <w:r>
-        <w:br/>
-      </w:r>
-    </w:p>
-    <w:p>
-      <w:pPr>
-        <w:pStyle w:val="Compact"/>
-        <w:numPr>
-          <w:ilvl w:val="0"/>
-          <w:numId w:val="1006"/>
+        <w:t xml:space="preserve">,</w:t>
+      </w:r>
+      <w:r>
+        <w:t xml:space="preserve"> </w:t>
+      </w:r>
+      <w:r>
+        <w:rPr>
+          <w:rStyle w:val="VerbatimChar"/>
+        </w:rPr>
+        <w:t xml:space="preserve">get_top_words</w:t>
+      </w:r>
+      <w:r>
+        <w:t xml:space="preserve">,</w:t>
+      </w:r>
+      <w:r>
+        <w:t xml:space="preserve"> </w:t>
+      </w:r>
+      <w:r>
+        <w:rPr>
+          <w:rStyle w:val="VerbatimChar"/>
+        </w:rPr>
+        <w:t xml:space="preserve">get_artefact_dir</w:t>
+      </w:r>
+      <w:r>
+        <w:br/>
+      </w:r>
+    </w:p>
+    <w:p>
+      <w:pPr>
+        <w:pStyle w:val="Compact"/>
+        <w:numPr>
+          <w:ilvl w:val="0"/>
+          <w:numId w:val="1008"/>
         </w:numPr>
       </w:pPr>
       <w:r>
@@ -2136,18 +2972,33 @@
         <w:t xml:space="preserve"> </w:t>
       </w:r>
       <w:r>
-        <w:t xml:space="preserve">– WhatsApp format parsing</w:t>
-      </w:r>
-      <w:r>
-        <w:br/>
-      </w:r>
-    </w:p>
-    <w:p>
-      <w:pPr>
-        <w:pStyle w:val="Compact"/>
-        <w:numPr>
-          <w:ilvl w:val="0"/>
-          <w:numId w:val="1006"/>
+        <w:t xml:space="preserve">–</w:t>
+      </w:r>
+      <w:r>
+        <w:t xml:space="preserve"> </w:t>
+      </w:r>
+      <w:r>
+        <w:rPr>
+          <w:rStyle w:val="VerbatimChar"/>
+        </w:rPr>
+        <w:t xml:space="preserve">parse_chat_from_string()</w:t>
+      </w:r>
+      <w:r>
+        <w:t xml:space="preserve"> </w:t>
+      </w:r>
+      <w:r>
+        <w:t xml:space="preserve">for WhatsApp, Telegram, Discord; malformed lines preserved</w:t>
+      </w:r>
+      <w:r>
+        <w:br/>
+      </w:r>
+    </w:p>
+    <w:p>
+      <w:pPr>
+        <w:pStyle w:val="Compact"/>
+        <w:numPr>
+          <w:ilvl w:val="0"/>
+          <w:numId w:val="1008"/>
         </w:numPr>
       </w:pPr>
       <w:r>
@@ -2170,11 +3021,60 @@
         <w:t xml:space="preserve"> </w:t>
       </w:r>
       <w:r>
-        <w:t xml:space="preserve">– Predict, Chat analysis, Train model, About</w:t>
-      </w:r>
-    </w:p>
-    <w:bookmarkEnd w:id="30"/>
-    <w:bookmarkStart w:id="31" w:name="configuration"/>
+        <w:t xml:space="preserve">– Predict (single, paste bulk, batch CSV), Chat analysis (upload/paste, format selector, date filter, per-sender summary, export), Train model (stats, feature importance, downloadable report/confusion matrix), About</w:t>
+      </w:r>
+      <w:r>
+        <w:br/>
+      </w:r>
+    </w:p>
+    <w:p>
+      <w:pPr>
+        <w:pStyle w:val="Compact"/>
+        <w:numPr>
+          <w:ilvl w:val="0"/>
+          <w:numId w:val="1008"/>
+        </w:numPr>
+      </w:pPr>
+      <w:r>
+        <w:rPr>
+          <w:b/>
+          <w:bCs/>
+        </w:rPr>
+        <w:t xml:space="preserve">Training:</w:t>
+      </w:r>
+      <w:r>
+        <w:t xml:space="preserve"> </w:t>
+      </w:r>
+      <w:r>
+        <w:rPr>
+          <w:rStyle w:val="VerbatimChar"/>
+        </w:rPr>
+        <w:t xml:space="preserve">train_model.py</w:t>
+      </w:r>
+      <w:r>
+        <w:t xml:space="preserve"> </w:t>
+      </w:r>
+      <w:r>
+        <w:t xml:space="preserve">– full training;</w:t>
+      </w:r>
+      <w:r>
+        <w:t xml:space="preserve"> </w:t>
+      </w:r>
+      <w:r>
+        <w:rPr>
+          <w:rStyle w:val="VerbatimChar"/>
+        </w:rPr>
+        <w:t xml:space="preserve">scripts/train_and_save.py</w:t>
+      </w:r>
+      <w:r>
+        <w:t xml:space="preserve"> </w:t>
+      </w:r>
+      <w:r>
+        <w:t xml:space="preserve">– retrain (max 30k samples) for sklearn version compatibility</w:t>
+      </w:r>
+    </w:p>
+    <w:bookmarkEnd w:id="32"/>
+    <w:bookmarkStart w:id="33" w:name="configuration"/>
     <w:p>
       <w:pPr>
         <w:pStyle w:val="Heading3"/>
@@ -2185,25 +3085,53 @@
     </w:p>
     <w:p>
       <w:pPr>
-        <w:pStyle w:val="FirstParagraph"/>
-      </w:pPr>
-      <w:r>
-        <w:t xml:space="preserve">The system auto-detects project root for both Colab/Drive and local environments. It supports</w:t>
-      </w:r>
-      <w:r>
-        <w:t xml:space="preserve"> </w:t>
+        <w:pStyle w:val="Compact"/>
+        <w:numPr>
+          <w:ilvl w:val="0"/>
+          <w:numId w:val="1009"/>
+        </w:numPr>
+      </w:pPr>
+      <w:r>
+        <w:t xml:space="preserve">Project root auto-detection for Colab (</w:t>
       </w:r>
       <w:r>
         <w:rPr>
           <w:rStyle w:val="VerbatimChar"/>
         </w:rPr>
+        <w:t xml:space="preserve">/content/drive/MyDrive/TrollGuard_Project*</w:t>
+      </w:r>
+      <w:r>
+        <w:t xml:space="preserve">), Streamlit Cloud, and local runs</w:t>
+      </w:r>
+      <w:r>
+        <w:br/>
+      </w:r>
+    </w:p>
+    <w:p>
+      <w:pPr>
+        <w:pStyle w:val="Compact"/>
+        <w:numPr>
+          <w:ilvl w:val="0"/>
+          <w:numId w:val="1009"/>
+        </w:numPr>
+      </w:pPr>
+      <w:r>
+        <w:t xml:space="preserve">Supports</w:t>
+      </w:r>
+      <w:r>
+        <w:t xml:space="preserve"> </w:t>
+      </w:r>
+      <w:r>
+        <w:rPr>
+          <w:rStyle w:val="VerbatimChar"/>
+        </w:rPr>
         <w:t xml:space="preserve">dataset/</w:t>
       </w:r>
       <w:r>
         <w:t xml:space="preserve"> </w:t>
       </w:r>
       <w:r>
-        <w:t xml:space="preserve">or</w:t>
+        <w:t xml:space="preserve">and</w:t>
       </w:r>
       <w:r>
         <w:t xml:space="preserve"> </w:t>
@@ -2218,25 +3146,167 @@
         <w:t xml:space="preserve"> </w:t>
       </w:r>
       <w:r>
-        <w:t xml:space="preserve">folder naming.</w:t>
-      </w:r>
-    </w:p>
-    <w:bookmarkEnd w:id="31"/>
-    <w:bookmarkStart w:id="32" w:name="deployment-target"/>
+        <w:t xml:space="preserve">folder names</w:t>
+      </w:r>
+      <w:r>
+        <w:br/>
+      </w:r>
+    </w:p>
+    <w:p>
+      <w:pPr>
+        <w:pStyle w:val="Compact"/>
+        <w:numPr>
+          <w:ilvl w:val="0"/>
+          <w:numId w:val="1009"/>
+        </w:numPr>
+      </w:pPr>
+      <w:r>
+        <w:t xml:space="preserve">Lazy model loading via</w:t>
+      </w:r>
+      <w:r>
+        <w:t xml:space="preserve"> </w:t>
+      </w:r>
+      <w:r>
+        <w:rPr>
+          <w:rStyle w:val="VerbatimChar"/>
+        </w:rPr>
+        <w:t xml:space="preserve">@st.cache_resource</w:t>
+      </w:r>
+      <w:r>
+        <w:br/>
+      </w:r>
+    </w:p>
+    <w:p>
+      <w:pPr>
+        <w:pStyle w:val="Compact"/>
+        <w:numPr>
+          <w:ilvl w:val="0"/>
+          <w:numId w:val="1009"/>
+        </w:numPr>
+      </w:pPr>
+      <w:r>
+        <w:t xml:space="preserve">Input limits: 50,000 chars; 10,000 rows for batch CSV</w:t>
+      </w:r>
+      <w:r>
+        <w:br/>
+      </w:r>
+    </w:p>
+    <w:p>
+      <w:pPr>
+        <w:pStyle w:val="Compact"/>
+        <w:numPr>
+          <w:ilvl w:val="0"/>
+          <w:numId w:val="1009"/>
+        </w:numPr>
+      </w:pPr>
+      <w:r>
+        <w:t xml:space="preserve">Sample fallback when no datasets present</w:t>
+      </w:r>
+    </w:p>
+    <w:bookmarkEnd w:id="33"/>
+    <w:bookmarkStart w:id="34" w:name="deployment-1"/>
     <w:p>
       <w:pPr>
         <w:pStyle w:val="Heading3"/>
       </w:pPr>
       <w:r>
-        <w:t xml:space="preserve">6.3 Deployment Target</w:t>
-      </w:r>
-    </w:p>
-    <w:p>
-      <w:pPr>
-        <w:pStyle w:val="FirstParagraph"/>
-      </w:pPr>
-      <w:r>
-        <w:t xml:space="preserve">Streamlit Cloud (or similar). The app runs with sample fallback data when no datasets are present.</w:t>
+        <w:t xml:space="preserve">6.3 Deployment</w:t>
+      </w:r>
+    </w:p>
+    <w:p>
+      <w:pPr>
+        <w:pStyle w:val="Compact"/>
+        <w:numPr>
+          <w:ilvl w:val="0"/>
+          <w:numId w:val="1010"/>
+        </w:numPr>
+      </w:pPr>
+      <w:r>
+        <w:rPr>
+          <w:b/>
+          <w:bCs/>
+        </w:rPr>
+        <w:t xml:space="preserve">Streamlit Cloud:</w:t>
+      </w:r>
+      <w:r>
+        <w:t xml:space="preserve"> </w:t>
+      </w:r>
+      <w:r>
+        <w:t xml:space="preserve">https://trollguard-eem9mwmcp2gtqwff95wu7v.streamlit.app/</w:t>
+      </w:r>
+      <w:r>
+        <w:br/>
+      </w:r>
+    </w:p>
+    <w:p>
+      <w:pPr>
+        <w:pStyle w:val="Compact"/>
+        <w:numPr>
+          <w:ilvl w:val="0"/>
+          <w:numId w:val="1010"/>
+        </w:numPr>
+      </w:pPr>
+      <w:r>
+        <w:rPr>
+          <w:b/>
+          <w:bCs/>
+        </w:rPr>
+        <w:t xml:space="preserve">GitHub:</w:t>
+      </w:r>
+      <w:r>
+        <w:t xml:space="preserve"> </w:t>
+      </w:r>
+      <w:r>
+        <w:t xml:space="preserve">https://github.com/itsmehari/TrollGuard</w:t>
+      </w:r>
+      <w:r>
+        <w:br/>
+      </w:r>
+    </w:p>
+    <w:p>
+      <w:pPr>
+        <w:pStyle w:val="Compact"/>
+        <w:numPr>
+          <w:ilvl w:val="0"/>
+          <w:numId w:val="1010"/>
+        </w:numPr>
+      </w:pPr>
+      <w:r>
+        <w:rPr>
+          <w:b/>
+          <w:bCs/>
+        </w:rPr>
+        <w:t xml:space="preserve">Theme:</w:t>
+      </w:r>
+      <w:r>
+        <w:t xml:space="preserve"> </w:t>
+      </w:r>
+      <w:r>
+        <w:t xml:space="preserve">Light (</w:t>
+      </w:r>
+      <w:r>
+        <w:rPr>
+          <w:rStyle w:val="VerbatimChar"/>
+        </w:rPr>
+        <w:t xml:space="preserve">.streamlit/config.toml</w:t>
+      </w:r>
+      <w:r>
+        <w:t xml:space="preserve">)</w:t>
+      </w:r>
+      <w:r>
+        <w:br/>
+      </w:r>
+    </w:p>
+    <w:p>
+      <w:pPr>
+        <w:pStyle w:val="Compact"/>
+        <w:numPr>
+          <w:ilvl w:val="0"/>
+          <w:numId w:val="1010"/>
+        </w:numPr>
+      </w:pPr>
+      <w:r>
+        <w:t xml:space="preserve">Runs with sample fallback data when no datasets are present</w:t>
       </w:r>
     </w:p>
     <w:p>
@@ -2246,9 +3316,9 @@
         </w:pict>
       </w:r>
     </w:p>
-    <w:bookmarkEnd w:id="32"/>
-    <w:bookmarkEnd w:id="33"/>
-    <w:bookmarkStart w:id="37" w:name="chapter-7-datasets"/>
+    <w:bookmarkEnd w:id="34"/>
+    <w:bookmarkEnd w:id="35"/>
+    <w:bookmarkStart w:id="39" w:name="chapter-7-datasets"/>
     <w:p>
       <w:pPr>
         <w:pStyle w:val="Heading2"/>
@@ -2257,7 +3327,7 @@
         <w:t xml:space="preserve">Chapter 7 – Datasets</w:t>
       </w:r>
     </w:p>
-    <w:bookmarkStart w:id="34" w:name="data-sources"/>
+    <w:bookmarkStart w:id="36" w:name="data-sources"/>
     <w:p>
       <w:pPr>
         <w:pStyle w:val="Heading3"/>
@@ -2271,35 +3341,59 @@
         <w:pStyle w:val="FirstParagraph"/>
       </w:pPr>
       <w:r>
-        <w:t xml:space="preserve">Eight publicly available parsed datasets:</w:t>
-      </w:r>
-    </w:p>
-    <w:p>
-      <w:pPr>
-        <w:pStyle w:val="Compact"/>
-        <w:numPr>
-          <w:ilvl w:val="0"/>
-          <w:numId w:val="1007"/>
-        </w:numPr>
-      </w:pPr>
+        <w:t xml:space="preserve">Parsed datasets in</w:t>
+      </w:r>
+      <w:r>
+        <w:t xml:space="preserve"> </w:t>
+      </w:r>
       <w:r>
         <w:rPr>
           <w:rStyle w:val="VerbatimChar"/>
         </w:rPr>
+        <w:t xml:space="preserve">dataset/</w:t>
+      </w:r>
+      <w:r>
+        <w:t xml:space="preserve"> </w:t>
+      </w:r>
+      <w:r>
+        <w:t xml:space="preserve">or</w:t>
+      </w:r>
+      <w:r>
+        <w:t xml:space="preserve"> </w:t>
+      </w:r>
+      <w:r>
+        <w:rPr>
+          <w:rStyle w:val="VerbatimChar"/>
+        </w:rPr>
+        <w:t xml:space="preserve">datasets/</w:t>
+      </w:r>
+      <w:r>
+        <w:t xml:space="preserve"> </w:t>
+      </w:r>
+      <w:r>
+        <w:t xml:space="preserve">(combined ~540,000+ rows):</w:t>
+      </w:r>
+    </w:p>
+    <w:p>
+      <w:pPr>
+        <w:pStyle w:val="Compact"/>
+        <w:numPr>
+          <w:ilvl w:val="0"/>
+          <w:numId w:val="1011"/>
+        </w:numPr>
+      </w:pPr>
+      <w:r>
+        <w:rPr>
+          <w:rStyle w:val="VerbatimChar"/>
+        </w:rPr>
         <w:t xml:space="preserve">aggression_parsed_dataset.csv</w:t>
       </w:r>
       <w:r>
-        <w:br/>
-      </w:r>
-    </w:p>
-    <w:p>
-      <w:pPr>
-        <w:pStyle w:val="Compact"/>
-        <w:numPr>
-          <w:ilvl w:val="0"/>
-          <w:numId w:val="1007"/>
-        </w:numPr>
-      </w:pPr>
+        <w:t xml:space="preserve">,</w:t>
+      </w:r>
+      <w:r>
+        <w:t xml:space="preserve"> </w:t>
+      </w:r>
       <w:r>
         <w:rPr>
           <w:rStyle w:val="VerbatimChar"/>
@@ -2307,17 +3401,11 @@
         <w:t xml:space="preserve">attack_parsed_dataset.csv</w:t>
       </w:r>
       <w:r>
-        <w:br/>
-      </w:r>
-    </w:p>
-    <w:p>
-      <w:pPr>
-        <w:pStyle w:val="Compact"/>
-        <w:numPr>
-          <w:ilvl w:val="0"/>
-          <w:numId w:val="1007"/>
-        </w:numPr>
-      </w:pPr>
+        <w:t xml:space="preserve">,</w:t>
+      </w:r>
+      <w:r>
+        <w:t xml:space="preserve"> </w:t>
+      </w:r>
       <w:r>
         <w:rPr>
           <w:rStyle w:val="VerbatimChar"/>
@@ -2333,7 +3421,7 @@
         <w:pStyle w:val="Compact"/>
         <w:numPr>
           <w:ilvl w:val="0"/>
-          <w:numId w:val="1007"/>
+          <w:numId w:val="1011"/>
         </w:numPr>
       </w:pPr>
       <w:r>
@@ -2343,17 +3431,11 @@
         <w:t xml:space="preserve">toxicity_parsed_dataset.csv</w:t>
       </w:r>
       <w:r>
-        <w:br/>
-      </w:r>
-    </w:p>
-    <w:p>
-      <w:pPr>
-        <w:pStyle w:val="Compact"/>
-        <w:numPr>
-          <w:ilvl w:val="0"/>
-          <w:numId w:val="1007"/>
-        </w:numPr>
-      </w:pPr>
+        <w:t xml:space="preserve">,</w:t>
+      </w:r>
+      <w:r>
+        <w:t xml:space="preserve"> </w:t>
+      </w:r>
       <w:r>
         <w:rPr>
           <w:rStyle w:val="VerbatimChar"/>
@@ -2369,7 +3451,7 @@
         <w:pStyle w:val="Compact"/>
         <w:numPr>
           <w:ilvl w:val="0"/>
-          <w:numId w:val="1007"/>
+          <w:numId w:val="1011"/>
         </w:numPr>
       </w:pPr>
       <w:r>
@@ -2379,17 +3461,11 @@
         <w:t xml:space="preserve">twitter_racism_parsed_dataset.csv</w:t>
       </w:r>
       <w:r>
-        <w:br/>
-      </w:r>
-    </w:p>
-    <w:p>
-      <w:pPr>
-        <w:pStyle w:val="Compact"/>
-        <w:numPr>
-          <w:ilvl w:val="0"/>
-          <w:numId w:val="1007"/>
-        </w:numPr>
-      </w:pPr>
+        <w:t xml:space="preserve">,</w:t>
+      </w:r>
+      <w:r>
+        <w:t xml:space="preserve"> </w:t>
+      </w:r>
       <w:r>
         <w:rPr>
           <w:rStyle w:val="VerbatimChar"/>
@@ -2405,7 +3481,7 @@
         <w:pStyle w:val="Compact"/>
         <w:numPr>
           <w:ilvl w:val="0"/>
-          <w:numId w:val="1007"/>
+          <w:numId w:val="1011"/>
         </w:numPr>
       </w:pPr>
       <w:r>
@@ -2414,17 +3490,161 @@
         </w:rPr>
         <w:t xml:space="preserve">youtube_parsed_dataset.csv</w:t>
       </w:r>
+      <w:r>
+        <w:br/>
+      </w:r>
+    </w:p>
+    <w:p>
+      <w:pPr>
+        <w:pStyle w:val="Compact"/>
+        <w:numPr>
+          <w:ilvl w:val="0"/>
+          <w:numId w:val="1011"/>
+        </w:numPr>
+      </w:pPr>
+      <w:r>
+        <w:rPr>
+          <w:rStyle w:val="VerbatimChar"/>
+        </w:rPr>
+        <w:t xml:space="preserve">augmented_parsed_dataset.csv</w:t>
+      </w:r>
+      <w:r>
+        <w:t xml:space="preserve"> </w:t>
+      </w:r>
+      <w:r>
+        <w:t xml:space="preserve">(from</w:t>
+      </w:r>
+      <w:r>
+        <w:t xml:space="preserve"> </w:t>
+      </w:r>
+      <w:r>
+        <w:rPr>
+          <w:rStyle w:val="VerbatimChar"/>
+        </w:rPr>
+        <w:t xml:space="preserve">scripts/augment_data.py</w:t>
+      </w:r>
+      <w:r>
+        <w:t xml:space="preserve">)</w:t>
+      </w:r>
+      <w:r>
+        <w:br/>
+      </w:r>
+    </w:p>
+    <w:p>
+      <w:pPr>
+        <w:pStyle w:val="Compact"/>
+        <w:numPr>
+          <w:ilvl w:val="0"/>
+          <w:numId w:val="1011"/>
+        </w:numPr>
+      </w:pPr>
+      <w:r>
+        <w:rPr>
+          <w:rStyle w:val="VerbatimChar"/>
+        </w:rPr>
+        <w:t xml:space="preserve">synthetic_parsed_dataset.csv</w:t>
+      </w:r>
+      <w:r>
+        <w:t xml:space="preserve"> </w:t>
+      </w:r>
+      <w:r>
+        <w:t xml:space="preserve">(from</w:t>
+      </w:r>
+      <w:r>
+        <w:t xml:space="preserve"> </w:t>
+      </w:r>
+      <w:r>
+        <w:rPr>
+          <w:rStyle w:val="VerbatimChar"/>
+        </w:rPr>
+        <w:t xml:space="preserve">scripts/generate_synthetic_data.py</w:t>
+      </w:r>
+      <w:r>
+        <w:t xml:space="preserve">)</w:t>
+      </w:r>
+      <w:r>
+        <w:br/>
+      </w:r>
+    </w:p>
+    <w:p>
+      <w:pPr>
+        <w:pStyle w:val="Compact"/>
+        <w:numPr>
+          <w:ilvl w:val="0"/>
+          <w:numId w:val="1011"/>
+        </w:numPr>
+      </w:pPr>
+      <w:r>
+        <w:rPr>
+          <w:rStyle w:val="VerbatimChar"/>
+        </w:rPr>
+        <w:t xml:space="preserve">olid_parsed_dataset.csv</w:t>
+      </w:r>
+      <w:r>
+        <w:t xml:space="preserve">,</w:t>
+      </w:r>
+      <w:r>
+        <w:t xml:space="preserve"> </w:t>
+      </w:r>
+      <w:r>
+        <w:rPr>
+          <w:rStyle w:val="VerbatimChar"/>
+        </w:rPr>
+        <w:t xml:space="preserve">hate_speech_parsed_dataset.csv</w:t>
+      </w:r>
+      <w:r>
+        <w:t xml:space="preserve"> </w:t>
+      </w:r>
+      <w:r>
+        <w:t xml:space="preserve">(from</w:t>
+      </w:r>
+      <w:r>
+        <w:t xml:space="preserve"> </w:t>
+      </w:r>
+      <w:r>
+        <w:rPr>
+          <w:rStyle w:val="VerbatimChar"/>
+        </w:rPr>
+        <w:t xml:space="preserve">scripts/download_datasets.py</w:t>
+      </w:r>
+      <w:r>
+        <w:t xml:space="preserve">)</w:t>
+      </w:r>
+      <w:r>
+        <w:br/>
+      </w:r>
+    </w:p>
+    <w:p>
+      <w:pPr>
+        <w:pStyle w:val="Compact"/>
+        <w:numPr>
+          <w:ilvl w:val="0"/>
+          <w:numId w:val="1011"/>
+        </w:numPr>
+      </w:pPr>
+      <w:r>
+        <w:rPr>
+          <w:rStyle w:val="VerbatimChar"/>
+        </w:rPr>
+        <w:t xml:space="preserve">jigsaw_toxic_parsed_dataset.csv</w:t>
+      </w:r>
+      <w:r>
+        <w:t xml:space="preserve"> </w:t>
+      </w:r>
+      <w:r>
+        <w:t xml:space="preserve">(Kaggle Jigsaw)</w:t>
+      </w:r>
     </w:p>
     <w:p>
       <w:pPr>
         <w:pStyle w:val="FirstParagraph"/>
       </w:pPr>
       <w:r>
-        <w:t xml:space="preserve">Combined size: ~449,000 rows. Class distribution: ~87% non-bullying, ~13% bullying.</w:t>
-      </w:r>
-    </w:p>
-    <w:bookmarkEnd w:id="34"/>
-    <w:bookmarkStart w:id="35" w:name="dataset-format"/>
+        <w:t xml:space="preserve">Class distribution approximately 87% non-bullying, 13% bullying.</w:t>
+      </w:r>
+    </w:p>
+    <w:bookmarkEnd w:id="36"/>
+    <w:bookmarkStart w:id="37" w:name="dataset-format"/>
     <w:p>
       <w:pPr>
         <w:pStyle w:val="Heading3"/>
@@ -2438,7 +3658,7 @@
         <w:pStyle w:val="Compact"/>
         <w:numPr>
           <w:ilvl w:val="0"/>
-          <w:numId w:val="1008"/>
+          <w:numId w:val="1012"/>
         </w:numPr>
       </w:pPr>
       <w:r>
@@ -2484,43 +3704,80 @@
         <w:pStyle w:val="Compact"/>
         <w:numPr>
           <w:ilvl w:val="0"/>
-          <w:numId w:val="1008"/>
-        </w:numPr>
-      </w:pPr>
-      <w:r>
-        <w:rPr>
-          <w:b/>
-          <w:bCs/>
-        </w:rPr>
-        <w:t xml:space="preserve">Chat export:</w:t>
-      </w:r>
-      <w:r>
-        <w:t xml:space="preserve"> </w:t>
-      </w:r>
-      <w:r>
-        <w:rPr>
-          <w:rStyle w:val="VerbatimChar"/>
-        </w:rPr>
-        <w:t xml:space="preserve">sample_chat.txt</w:t>
-      </w:r>
-      <w:r>
-        <w:t xml:space="preserve"> </w:t>
-      </w:r>
-      <w:r>
-        <w:t xml:space="preserve">in format</w:t>
-      </w:r>
-      <w:r>
-        <w:t xml:space="preserve"> </w:t>
-      </w:r>
-      <w:r>
-        <w:rPr>
-          <w:rStyle w:val="VerbatimChar"/>
-        </w:rPr>
-        <w:t xml:space="preserve">DD/MM/YYYY, HH:MM - Sender: message</w:t>
-      </w:r>
-    </w:p>
-    <w:bookmarkEnd w:id="35"/>
-    <w:bookmarkStart w:id="36" w:name="data-loader-utility"/>
+          <w:numId w:val="1012"/>
+        </w:numPr>
+      </w:pPr>
+      <w:r>
+        <w:rPr>
+          <w:b/>
+          <w:bCs/>
+        </w:rPr>
+        <w:t xml:space="preserve">Label normalisation:</w:t>
+      </w:r>
+      <w:r>
+        <w:t xml:space="preserve"> </w:t>
+      </w:r>
+      <w:r>
+        <w:t xml:space="preserve">String labels like</w:t>
+      </w:r>
+      <w:r>
+        <w:t xml:space="preserve"> </w:t>
+      </w:r>
+      <w:r>
+        <w:t xml:space="preserve">“none”</w:t>
+      </w:r>
+      <w:r>
+        <w:t xml:space="preserve">,</w:t>
+      </w:r>
+      <w:r>
+        <w:t xml:space="preserve"> </w:t>
+      </w:r>
+      <w:r>
+        <w:t xml:space="preserve">“normal”</w:t>
+      </w:r>
+      <w:r>
+        <w:t xml:space="preserve">,</w:t>
+      </w:r>
+      <w:r>
+        <w:t xml:space="preserve"> </w:t>
+      </w:r>
+      <w:r>
+        <w:t xml:space="preserve">“non-toxic”</w:t>
+      </w:r>
+      <w:r>
+        <w:t xml:space="preserve"> </w:t>
+      </w:r>
+      <w:r>
+        <w:t xml:space="preserve">mapped to 0</w:t>
+      </w:r>
+      <w:r>
+        <w:br/>
+      </w:r>
+    </w:p>
+    <w:p>
+      <w:pPr>
+        <w:pStyle w:val="Compact"/>
+        <w:numPr>
+          <w:ilvl w:val="0"/>
+          <w:numId w:val="1012"/>
+        </w:numPr>
+      </w:pPr>
+      <w:r>
+        <w:rPr>
+          <w:b/>
+          <w:bCs/>
+        </w:rPr>
+        <w:t xml:space="preserve">Chat formats:</w:t>
+      </w:r>
+      <w:r>
+        <w:t xml:space="preserve"> </w:t>
+      </w:r>
+      <w:r>
+        <w:t xml:space="preserve">See Chapter 4.3</w:t>
+      </w:r>
+    </w:p>
+    <w:bookmarkEnd w:id="37"/>
+    <w:bookmarkStart w:id="38" w:name="data-loader-utility"/>
     <w:p>
       <w:pPr>
         <w:pStyle w:val="Heading3"/>
@@ -2574,9 +3831,9 @@
         </w:pict>
       </w:r>
     </w:p>
-    <w:bookmarkEnd w:id="36"/>
-    <w:bookmarkEnd w:id="37"/>
-    <w:bookmarkStart w:id="41" w:name="chapter-8-results"/>
+    <w:bookmarkEnd w:id="38"/>
+    <w:bookmarkEnd w:id="39"/>
+    <w:bookmarkStart w:id="43" w:name="chapter-8-results"/>
     <w:p>
       <w:pPr>
         <w:pStyle w:val="Heading2"/>
@@ -2585,7 +3842,7 @@
         <w:t xml:space="preserve">Chapter 8 – Results</w:t>
       </w:r>
     </w:p>
-    <w:bookmarkStart w:id="38" w:name="evaluation-metrics"/>
+    <w:bookmarkStart w:id="40" w:name="evaluation-metrics"/>
     <w:p>
       <w:pPr>
         <w:pStyle w:val="Heading3"/>
@@ -2599,7 +3856,7 @@
         <w:pStyle w:val="Compact"/>
         <w:numPr>
           <w:ilvl w:val="0"/>
-          <w:numId w:val="1009"/>
+          <w:numId w:val="1013"/>
         </w:numPr>
       </w:pPr>
       <w:r>
@@ -2624,7 +3881,7 @@
         <w:pStyle w:val="Compact"/>
         <w:numPr>
           <w:ilvl w:val="0"/>
-          <w:numId w:val="1009"/>
+          <w:numId w:val="1013"/>
         </w:numPr>
       </w:pPr>
       <w:r>
@@ -2649,7 +3906,7 @@
         <w:pStyle w:val="Compact"/>
         <w:numPr>
           <w:ilvl w:val="0"/>
-          <w:numId w:val="1009"/>
+          <w:numId w:val="1013"/>
         </w:numPr>
       </w:pPr>
       <w:r>
@@ -2674,7 +3931,7 @@
         <w:pStyle w:val="Compact"/>
         <w:numPr>
           <w:ilvl w:val="0"/>
-          <w:numId w:val="1009"/>
+          <w:numId w:val="1013"/>
         </w:numPr>
       </w:pPr>
       <w:r>
@@ -2699,7 +3956,7 @@
         <w:pStyle w:val="Compact"/>
         <w:numPr>
           <w:ilvl w:val="0"/>
-          <w:numId w:val="1009"/>
+          <w:numId w:val="1013"/>
         </w:numPr>
       </w:pPr>
       <w:r>
@@ -2716,8 +3973,8 @@
         <w:t xml:space="preserve">2×2 grid of true vs predicted</w:t>
       </w:r>
     </w:p>
-    <w:bookmarkEnd w:id="38"/>
-    <w:bookmarkStart w:id="39" w:name="baseline-results"/>
+    <w:bookmarkEnd w:id="40"/>
+    <w:bookmarkStart w:id="41" w:name="baseline-results"/>
     <w:p>
       <w:pPr>
         <w:pStyle w:val="Heading3"/>
@@ -2731,11 +3988,11 @@
         <w:pStyle w:val="FirstParagraph"/>
       </w:pPr>
       <w:r>
-        <w:t xml:space="preserve">The Logistic Regression + TF-IDF baseline typically achieves accuracy in the 70–85% range. F1 for the bullying class is lower due to class imbalance.</w:t>
-      </w:r>
-    </w:p>
-    <w:bookmarkEnd w:id="39"/>
-    <w:bookmarkStart w:id="40" w:name="chat-export-analysis"/>
+        <w:t xml:space="preserve">The Logistic Regression + TF-IDF baseline achieves accuracy in the 85–92% range on held-out test data. F1 for the bullying class is lower due to class imbalance. Feature importance (top bullying/safe words) is available in the sidebar and Train tab.</w:t>
+      </w:r>
+    </w:p>
+    <w:bookmarkEnd w:id="41"/>
+    <w:bookmarkStart w:id="42" w:name="chat-export-analysis"/>
     <w:p>
       <w:pPr>
         <w:pStyle w:val="Heading3"/>
@@ -2749,7 +4006,7 @@
         <w:pStyle w:val="FirstParagraph"/>
       </w:pPr>
       <w:r>
-        <w:t xml:space="preserve">The system produces per-message predictions and per-sender summaries (total messages, flagged count, flagged rate).</w:t>
+        <w:t xml:space="preserve">The system produces per-message predictions and per-sender summaries (total messages, flagged count, flagged %). Users can filter by date range and export results to CSV.</w:t>
       </w:r>
     </w:p>
     <w:p>
@@ -2759,9 +4016,9 @@
         </w:pict>
       </w:r>
     </w:p>
-    <w:bookmarkEnd w:id="40"/>
-    <w:bookmarkEnd w:id="41"/>
-    <w:bookmarkStart w:id="42" w:name="chapter-9-limitations"/>
+    <w:bookmarkEnd w:id="42"/>
+    <w:bookmarkEnd w:id="43"/>
+    <w:bookmarkStart w:id="44" w:name="chapter-9-limitations"/>
     <w:p>
       <w:pPr>
         <w:pStyle w:val="Heading2"/>
@@ -2775,7 +4032,7 @@
         <w:pStyle w:val="Compact"/>
         <w:numPr>
           <w:ilvl w:val="0"/>
-          <w:numId w:val="1010"/>
+          <w:numId w:val="1014"/>
         </w:numPr>
       </w:pPr>
       <w:r>
@@ -2800,7 +4057,7 @@
         <w:pStyle w:val="Compact"/>
         <w:numPr>
           <w:ilvl w:val="0"/>
-          <w:numId w:val="1010"/>
+          <w:numId w:val="1014"/>
         </w:numPr>
       </w:pPr>
       <w:r>
@@ -2825,7 +4082,7 @@
         <w:pStyle w:val="Compact"/>
         <w:numPr>
           <w:ilvl w:val="0"/>
-          <w:numId w:val="1010"/>
+          <w:numId w:val="1014"/>
         </w:numPr>
       </w:pPr>
       <w:r>
@@ -2850,7 +4107,7 @@
         <w:pStyle w:val="Compact"/>
         <w:numPr>
           <w:ilvl w:val="0"/>
-          <w:numId w:val="1010"/>
+          <w:numId w:val="1014"/>
         </w:numPr>
       </w:pPr>
       <w:r>
@@ -2864,18 +4121,18 @@
         <w:t xml:space="preserve"> </w:t>
       </w:r>
       <w:r>
-        <w:t xml:space="preserve">Performance depends on training data; may not generalise to all bullying types</w:t>
-      </w:r>
-      <w:r>
-        <w:br/>
-      </w:r>
-    </w:p>
-    <w:p>
-      <w:pPr>
-        <w:pStyle w:val="Compact"/>
-        <w:numPr>
-          <w:ilvl w:val="0"/>
-          <w:numId w:val="1010"/>
+        <w:t xml:space="preserve">Performance depends on training data</w:t>
+      </w:r>
+      <w:r>
+        <w:br/>
+      </w:r>
+    </w:p>
+    <w:p>
+      <w:pPr>
+        <w:pStyle w:val="Compact"/>
+        <w:numPr>
+          <w:ilvl w:val="0"/>
+          <w:numId w:val="1014"/>
         </w:numPr>
       </w:pPr>
       <w:r>
@@ -2889,32 +4146,57 @@
         <w:t xml:space="preserve"> </w:t>
       </w:r>
       <w:r>
-        <w:t xml:space="preserve">Offline/batch processing; no live API deployment by default</w:t>
-      </w:r>
-      <w:r>
-        <w:br/>
-      </w:r>
-    </w:p>
-    <w:p>
-      <w:pPr>
-        <w:pStyle w:val="Compact"/>
-        <w:numPr>
-          <w:ilvl w:val="0"/>
-          <w:numId w:val="1010"/>
-        </w:numPr>
-      </w:pPr>
-      <w:r>
-        <w:rPr>
-          <w:b/>
-          <w:bCs/>
-        </w:rPr>
-        <w:t xml:space="preserve">False positives/negatives:</w:t>
-      </w:r>
-      <w:r>
-        <w:t xml:space="preserve"> </w:t>
-      </w:r>
-      <w:r>
-        <w:t xml:space="preserve">Sarcasm, coded language, and subtle aggression remain challenging</w:t>
+        <w:t xml:space="preserve">Offline/batch processing; no live API by default</w:t>
+      </w:r>
+      <w:r>
+        <w:br/>
+      </w:r>
+    </w:p>
+    <w:p>
+      <w:pPr>
+        <w:pStyle w:val="Compact"/>
+        <w:numPr>
+          <w:ilvl w:val="0"/>
+          <w:numId w:val="1014"/>
+        </w:numPr>
+      </w:pPr>
+      <w:r>
+        <w:rPr>
+          <w:b/>
+          <w:bCs/>
+        </w:rPr>
+        <w:t xml:space="preserve">Input limits:</w:t>
+      </w:r>
+      <w:r>
+        <w:t xml:space="preserve"> </w:t>
+      </w:r>
+      <w:r>
+        <w:t xml:space="preserve">50K chars, 10K batch rows</w:t>
+      </w:r>
+      <w:r>
+        <w:br/>
+      </w:r>
+    </w:p>
+    <w:p>
+      <w:pPr>
+        <w:pStyle w:val="Compact"/>
+        <w:numPr>
+          <w:ilvl w:val="0"/>
+          <w:numId w:val="1014"/>
+        </w:numPr>
+      </w:pPr>
+      <w:r>
+        <w:rPr>
+          <w:b/>
+          <w:bCs/>
+        </w:rPr>
+        <w:t xml:space="preserve">Sarcasm/coded language:</w:t>
+      </w:r>
+      <w:r>
+        <w:t xml:space="preserve"> </w:t>
+      </w:r>
+      <w:r>
+        <w:t xml:space="preserve">Challenging for TF-IDF + LR</w:t>
       </w:r>
     </w:p>
     <w:p>
@@ -2924,8 +4206,8 @@
         </w:pict>
       </w:r>
     </w:p>
-    <w:bookmarkEnd w:id="42"/>
-    <w:bookmarkStart w:id="43" w:name="chapter-10-future-work"/>
+    <w:bookmarkEnd w:id="44"/>
+    <w:bookmarkStart w:id="45" w:name="chapter-10-future-work"/>
     <w:p>
       <w:pPr>
         <w:pStyle w:val="Heading2"/>
@@ -2939,7 +4221,7 @@
         <w:pStyle w:val="Compact"/>
         <w:numPr>
           <w:ilvl w:val="0"/>
-          <w:numId w:val="1011"/>
+          <w:numId w:val="1015"/>
         </w:numPr>
       </w:pPr>
       <w:r>
@@ -2953,18 +4235,18 @@
         <w:t xml:space="preserve"> </w:t>
       </w:r>
       <w:r>
-        <w:t xml:space="preserve">– Handle regional languages and code-mixing</w:t>
-      </w:r>
-      <w:r>
-        <w:br/>
-      </w:r>
-    </w:p>
-    <w:p>
-      <w:pPr>
-        <w:pStyle w:val="Compact"/>
-        <w:numPr>
-          <w:ilvl w:val="0"/>
-          <w:numId w:val="1011"/>
+        <w:t xml:space="preserve">– Regional languages and code-mixing</w:t>
+      </w:r>
+      <w:r>
+        <w:br/>
+      </w:r>
+    </w:p>
+    <w:p>
+      <w:pPr>
+        <w:pStyle w:val="Compact"/>
+        <w:numPr>
+          <w:ilvl w:val="0"/>
+          <w:numId w:val="1015"/>
         </w:numPr>
       </w:pPr>
       <w:r>
@@ -2978,18 +4260,18 @@
         <w:t xml:space="preserve"> </w:t>
       </w:r>
       <w:r>
-        <w:t xml:space="preserve">– REST API for integration into chat applications</w:t>
-      </w:r>
-      <w:r>
-        <w:br/>
-      </w:r>
-    </w:p>
-    <w:p>
-      <w:pPr>
-        <w:pStyle w:val="Compact"/>
-        <w:numPr>
-          <w:ilvl w:val="0"/>
-          <w:numId w:val="1011"/>
+        <w:t xml:space="preserve">– REST API for integration</w:t>
+      </w:r>
+      <w:r>
+        <w:br/>
+      </w:r>
+    </w:p>
+    <w:p>
+      <w:pPr>
+        <w:pStyle w:val="Compact"/>
+        <w:numPr>
+          <w:ilvl w:val="0"/>
+          <w:numId w:val="1015"/>
         </w:numPr>
       </w:pPr>
       <w:r>
@@ -3014,7 +4296,7 @@
         <w:pStyle w:val="Compact"/>
         <w:numPr>
           <w:ilvl w:val="0"/>
-          <w:numId w:val="1011"/>
+          <w:numId w:val="1015"/>
         </w:numPr>
       </w:pPr>
       <w:r>
@@ -3028,43 +4310,18 @@
         <w:t xml:space="preserve"> </w:t>
       </w:r>
       <w:r>
-        <w:t xml:space="preserve">– Image, voice, and video content</w:t>
-      </w:r>
-      <w:r>
-        <w:br/>
-      </w:r>
-    </w:p>
-    <w:p>
-      <w:pPr>
-        <w:pStyle w:val="Compact"/>
-        <w:numPr>
-          <w:ilvl w:val="0"/>
-          <w:numId w:val="1011"/>
-        </w:numPr>
-      </w:pPr>
-      <w:r>
-        <w:rPr>
-          <w:b/>
-          <w:bCs/>
-        </w:rPr>
-        <w:t xml:space="preserve">Explainability</w:t>
-      </w:r>
-      <w:r>
-        <w:t xml:space="preserve"> </w:t>
-      </w:r>
-      <w:r>
-        <w:t xml:space="preserve">– Show which words/phrases triggered the flag</w:t>
-      </w:r>
-      <w:r>
-        <w:br/>
-      </w:r>
-    </w:p>
-    <w:p>
-      <w:pPr>
-        <w:pStyle w:val="Compact"/>
-        <w:numPr>
-          <w:ilvl w:val="0"/>
-          <w:numId w:val="1011"/>
+        <w:t xml:space="preserve">– Image, voice, video</w:t>
+      </w:r>
+      <w:r>
+        <w:br/>
+      </w:r>
+    </w:p>
+    <w:p>
+      <w:pPr>
+        <w:pStyle w:val="Compact"/>
+        <w:numPr>
+          <w:ilvl w:val="0"/>
+          <w:numId w:val="1015"/>
         </w:numPr>
       </w:pPr>
       <w:r>
@@ -3078,7 +4335,19 @@
         <w:t xml:space="preserve"> </w:t>
       </w:r>
       <w:r>
-        <w:t xml:space="preserve">– BERT or similar for contextual understanding</w:t>
+        <w:t xml:space="preserve">– BERT or similar</w:t>
+      </w:r>
+    </w:p>
+    <w:p>
+      <w:pPr>
+        <w:pStyle w:val="FirstParagraph"/>
+      </w:pPr>
+      <w:r>
+        <w:rPr>
+          <w:i/>
+          <w:iCs/>
+        </w:rPr>
+        <w:t xml:space="preserve">Note: Explainability via feature importance (top bullying/safe words) is already implemented.</w:t>
       </w:r>
     </w:p>
     <w:p>
@@ -3088,8 +4357,8 @@
         </w:pict>
       </w:r>
     </w:p>
-    <w:bookmarkEnd w:id="43"/>
-    <w:bookmarkStart w:id="44" w:name="chapter-11-business-model"/>
+    <w:bookmarkEnd w:id="45"/>
+    <w:bookmarkStart w:id="46" w:name="chapter-11-business-model"/>
     <w:p>
       <w:pPr>
         <w:pStyle w:val="Heading2"/>
@@ -3111,7 +4380,7 @@
         <w:pStyle w:val="Compact"/>
         <w:numPr>
           <w:ilvl w:val="0"/>
-          <w:numId w:val="1012"/>
+          <w:numId w:val="1016"/>
         </w:numPr>
       </w:pPr>
       <w:r>
@@ -3125,18 +4394,18 @@
         <w:t xml:space="preserve"> </w:t>
       </w:r>
       <w:r>
-        <w:t xml:space="preserve">Tool for schools and colleges to monitor group chats and forums</w:t>
-      </w:r>
-      <w:r>
-        <w:br/>
-      </w:r>
-    </w:p>
-    <w:p>
-      <w:pPr>
-        <w:pStyle w:val="Compact"/>
-        <w:numPr>
-          <w:ilvl w:val="0"/>
-          <w:numId w:val="1012"/>
+        <w:t xml:space="preserve">Tool for schools and colleges</w:t>
+      </w:r>
+      <w:r>
+        <w:br/>
+      </w:r>
+    </w:p>
+    <w:p>
+      <w:pPr>
+        <w:pStyle w:val="Compact"/>
+        <w:numPr>
+          <w:ilvl w:val="0"/>
+          <w:numId w:val="1016"/>
         </w:numPr>
       </w:pPr>
       <w:r>
@@ -3150,18 +4419,18 @@
         <w:t xml:space="preserve"> </w:t>
       </w:r>
       <w:r>
-        <w:t xml:space="preserve">Subscription-based moderation API for small platforms</w:t>
-      </w:r>
-      <w:r>
-        <w:br/>
-      </w:r>
-    </w:p>
-    <w:p>
-      <w:pPr>
-        <w:pStyle w:val="Compact"/>
-        <w:numPr>
-          <w:ilvl w:val="0"/>
-          <w:numId w:val="1012"/>
+        <w:t xml:space="preserve">Subscription-based moderation API</w:t>
+      </w:r>
+      <w:r>
+        <w:br/>
+      </w:r>
+    </w:p>
+    <w:p>
+      <w:pPr>
+        <w:pStyle w:val="Compact"/>
+        <w:numPr>
+          <w:ilvl w:val="0"/>
+          <w:numId w:val="1016"/>
         </w:numPr>
       </w:pPr>
       <w:r>
@@ -3175,18 +4444,18 @@
         <w:t xml:space="preserve"> </w:t>
       </w:r>
       <w:r>
-        <w:t xml:space="preserve">Custom models for organisations with domain-specific data</w:t>
-      </w:r>
-      <w:r>
-        <w:br/>
-      </w:r>
-    </w:p>
-    <w:p>
-      <w:pPr>
-        <w:pStyle w:val="Compact"/>
-        <w:numPr>
-          <w:ilvl w:val="0"/>
-          <w:numId w:val="1012"/>
+        <w:t xml:space="preserve">Custom models for organisations</w:t>
+      </w:r>
+      <w:r>
+        <w:br/>
+      </w:r>
+    </w:p>
+    <w:p>
+      <w:pPr>
+        <w:pStyle w:val="Compact"/>
+        <w:numPr>
+          <w:ilvl w:val="0"/>
+          <w:numId w:val="1016"/>
         </w:numPr>
       </w:pPr>
       <w:r>
@@ -3200,7 +4469,7 @@
         <w:t xml:space="preserve"> </w:t>
       </w:r>
       <w:r>
-        <w:t xml:space="preserve">Community-driven improvements with optional premium support</w:t>
+        <w:t xml:space="preserve">Community-driven improvements</w:t>
       </w:r>
     </w:p>
     <w:p>
@@ -3210,8 +4479,8 @@
         </w:pict>
       </w:r>
     </w:p>
-    <w:bookmarkEnd w:id="44"/>
-    <w:bookmarkStart w:id="45" w:name="chapter-12-conclusion"/>
+    <w:bookmarkEnd w:id="46"/>
+    <w:bookmarkStart w:id="47" w:name="chapter-12-conclusion"/>
     <w:p>
       <w:pPr>
         <w:pStyle w:val="Heading2"/>
@@ -3225,7 +4494,7 @@
         <w:pStyle w:val="FirstParagraph"/>
       </w:pPr>
       <w:r>
-        <w:t xml:space="preserve">TrollGuard demonstrates how supervised text classification can be applied to cyberbullying detection. The pipeline—from dataset loading and cleaning to feature engineering, model training, evaluation, and deployment—offers a practical example suitable for a B.Sc. final year project.</w:t>
+        <w:t xml:space="preserve">TrollGuard demonstrates how supervised text classification can be applied to cyberbullying detection. The pipeline—from dataset loading, augmentation, and cleaning to feature engineering, model training, evaluation, and deployment—offers a practical example suitable for a B.Sc. final year project.</w:t>
       </w:r>
     </w:p>
     <w:p>
@@ -3233,7 +4502,7 @@
         <w:pStyle w:val="BodyText"/>
       </w:pPr>
       <w:r>
-        <w:t xml:space="preserve">The TF-IDF + Logistic Regression baseline shows that simple approaches can flag a significant proportion of harmful messages. More advanced representations can improve performance for subtle cases. Responsible deployment will require attention to fairness, privacy, and human-in-the-loop moderation.</w:t>
+        <w:t xml:space="preserve">The TF-IDF + Logistic Regression baseline shows that simple approaches can flag a significant proportion of harmful messages. The Streamlit app supports single and bulk prediction, multi-format chat analysis with date filtering and per-sender summaries, and in-app retraining with downloadable reports. Responsible deployment will require attention to fairness, privacy, and human-in-the-loop moderation.</w:t>
       </w:r>
     </w:p>
     <w:p>
@@ -3243,8 +4512,8 @@
         </w:pict>
       </w:r>
     </w:p>
-    <w:bookmarkEnd w:id="45"/>
-    <w:bookmarkStart w:id="50" w:name="references"/>
+    <w:bookmarkEnd w:id="47"/>
+    <w:bookmarkStart w:id="48" w:name="references"/>
     <w:p>
       <w:pPr>
         <w:pStyle w:val="Heading2"/>
@@ -3257,7 +4526,7 @@
       <w:pPr>
         <w:numPr>
           <w:ilvl w:val="0"/>
-          <w:numId w:val="1013"/>
+          <w:numId w:val="1017"/>
         </w:numPr>
       </w:pPr>
       <w:r>
@@ -3276,20 +4545,15 @@
       <w:r>
         <w:t xml:space="preserve"> </w:t>
       </w:r>
-      <w:hyperlink r:id="rId46">
-        <w:r>
-          <w:rPr>
-            <w:rStyle w:val="Hyperlink"/>
-          </w:rPr>
-          <w:t xml:space="preserve">https://scikit-learn.org/stable/modules/generated/sklearn.feature_extraction.text.TfidfVectorizer.html</w:t>
-        </w:r>
-      </w:hyperlink>
-    </w:p>
-    <w:p>
-      <w:pPr>
-        <w:numPr>
-          <w:ilvl w:val="0"/>
-          <w:numId w:val="1013"/>
+      <w:r>
+        <w:t xml:space="preserve">https://scikit-learn.org/stable/modules/generated/sklearn.feature_extraction.text.TfidfVectorizer.html</w:t>
+      </w:r>
+    </w:p>
+    <w:p>
+      <w:pPr>
+        <w:numPr>
+          <w:ilvl w:val="0"/>
+          <w:numId w:val="1017"/>
         </w:numPr>
       </w:pPr>
       <w:r>
@@ -3308,20 +4572,15 @@
       <w:r>
         <w:t xml:space="preserve"> </w:t>
       </w:r>
-      <w:hyperlink r:id="rId47">
-        <w:r>
-          <w:rPr>
-            <w:rStyle w:val="Hyperlink"/>
-          </w:rPr>
-          <w:t xml:space="preserve">https://scikit-learn.org/stable/modules/linear_model.html#logistic-regression</w:t>
-        </w:r>
-      </w:hyperlink>
-    </w:p>
-    <w:p>
-      <w:pPr>
-        <w:numPr>
-          <w:ilvl w:val="0"/>
-          <w:numId w:val="1013"/>
+      <w:r>
+        <w:t xml:space="preserve">https://scikit-learn.org/stable/modules/linear_model.html#logistic-regression</w:t>
+      </w:r>
+    </w:p>
+    <w:p>
+      <w:pPr>
+        <w:numPr>
+          <w:ilvl w:val="0"/>
+          <w:numId w:val="1017"/>
         </w:numPr>
       </w:pPr>
       <w:r>
@@ -3340,20 +4599,15 @@
       <w:r>
         <w:t xml:space="preserve"> </w:t>
       </w:r>
-      <w:hyperlink r:id="rId48">
-        <w:r>
-          <w:rPr>
-            <w:rStyle w:val="Hyperlink"/>
-          </w:rPr>
-          <w:t xml:space="preserve">https://docs.python.org/3/</w:t>
-        </w:r>
-      </w:hyperlink>
-    </w:p>
-    <w:p>
-      <w:pPr>
-        <w:numPr>
-          <w:ilvl w:val="0"/>
-          <w:numId w:val="1013"/>
+      <w:r>
+        <w:t xml:space="preserve">https://docs.python.org/3/</w:t>
+      </w:r>
+    </w:p>
+    <w:p>
+      <w:pPr>
+        <w:numPr>
+          <w:ilvl w:val="0"/>
+          <w:numId w:val="1017"/>
         </w:numPr>
       </w:pPr>
       <w:r>
@@ -3372,20 +4626,15 @@
       <w:r>
         <w:t xml:space="preserve"> </w:t>
       </w:r>
-      <w:hyperlink r:id="rId49">
-        <w:r>
-          <w:rPr>
-            <w:rStyle w:val="Hyperlink"/>
-          </w:rPr>
-          <w:t xml:space="preserve">https://docs.streamlit.io/</w:t>
-        </w:r>
-      </w:hyperlink>
-    </w:p>
-    <w:p>
-      <w:pPr>
-        <w:numPr>
-          <w:ilvl w:val="0"/>
-          <w:numId w:val="1013"/>
+      <w:r>
+        <w:t xml:space="preserve">https://docs.streamlit.io/</w:t>
+      </w:r>
+    </w:p>
+    <w:p>
+      <w:pPr>
+        <w:numPr>
+          <w:ilvl w:val="0"/>
+          <w:numId w:val="1017"/>
         </w:numPr>
       </w:pPr>
       <w:r>
@@ -3396,22 +4645,22 @@
       <w:pPr>
         <w:numPr>
           <w:ilvl w:val="0"/>
-          <w:numId w:val="1013"/>
-        </w:numPr>
-      </w:pPr>
-      <w:r>
-        <w:t xml:space="preserve">Research on toxic comment classification and cyberbullying detection (cite specific papers used).</w:t>
-      </w:r>
-    </w:p>
-    <w:p>
-      <w:pPr>
-        <w:numPr>
-          <w:ilvl w:val="0"/>
-          <w:numId w:val="1013"/>
-        </w:numPr>
-      </w:pPr>
-      <w:r>
-        <w:t xml:space="preserve">Kaggle / public dataset sources used in the project.</w:t>
+          <w:numId w:val="1017"/>
+        </w:numPr>
+      </w:pPr>
+      <w:r>
+        <w:t xml:space="preserve">Research on toxic comment classification and cyberbullying detection.</w:t>
+      </w:r>
+    </w:p>
+    <w:p>
+      <w:pPr>
+        <w:numPr>
+          <w:ilvl w:val="0"/>
+          <w:numId w:val="1017"/>
+        </w:numPr>
+      </w:pPr>
+      <w:r>
+        <w:t xml:space="preserve">Kaggle / Hugging Face / public dataset sources used.</w:t>
       </w:r>
     </w:p>
     <w:p>
@@ -3421,8 +4670,8 @@
         </w:pict>
       </w:r>
     </w:p>
-    <w:bookmarkEnd w:id="50"/>
-    <w:bookmarkStart w:id="54" w:name="appendices"/>
+    <w:bookmarkEnd w:id="48"/>
+    <w:bookmarkStart w:id="52" w:name="appendices"/>
     <w:p>
       <w:pPr>
         <w:pStyle w:val="Heading2"/>
@@ -3431,7 +4680,7 @@
         <w:t xml:space="preserve">Appendices</w:t>
       </w:r>
     </w:p>
-    <w:bookmarkStart w:id="51" w:name="appendix-a-sample-code-snippets"/>
+    <w:bookmarkStart w:id="49" w:name="appendix-a-sample-code-snippets"/>
     <w:p>
       <w:pPr>
         <w:pStyle w:val="Heading3"/>
@@ -3478,7 +4727,7 @@
         <w:rPr>
           <w:rStyle w:val="NormalTok"/>
         </w:rPr>
-        <w:t xml:space="preserve"> load_parsed_datasets</w:t>
+        <w:t xml:space="preserve"> load_parsed_datasets, get_sample_fallback</w:t>
       </w:r>
       <w:r>
         <w:br/>
@@ -3501,6 +4750,42 @@
         </w:rPr>
         <w:t xml:space="preserve"> load_parsed_datasets()</w:t>
       </w:r>
+      <w:r>
+        <w:br/>
+      </w:r>
+      <w:r>
+        <w:rPr>
+          <w:rStyle w:val="ControlFlowTok"/>
+        </w:rPr>
+        <w:t xml:space="preserve">if</w:t>
+      </w:r>
+      <w:r>
+        <w:rPr>
+          <w:rStyle w:val="NormalTok"/>
+        </w:rPr>
+        <w:t xml:space="preserve"> df.empty:</w:t>
+      </w:r>
+      <w:r>
+        <w:br/>
+      </w:r>
+      <w:r>
+        <w:rPr>
+          <w:rStyle w:val="NormalTok"/>
+        </w:rPr>
+        <w:t xml:space="preserve">    df </w:t>
+      </w:r>
+      <w:r>
+        <w:rPr>
+          <w:rStyle w:val="OperatorTok"/>
+        </w:rPr>
+        <w:t xml:space="preserve">=</w:t>
+      </w:r>
+      <w:r>
+        <w:rPr>
+          <w:rStyle w:val="NormalTok"/>
+        </w:rPr>
+        <w:t xml:space="preserve"> get_sample_fallback()</w:t>
+      </w:r>
     </w:p>
     <w:p>
       <w:pPr>
@@ -3614,7 +4899,7 @@
         <w:rPr>
           <w:rStyle w:val="NormalTok"/>
         </w:rPr>
-        <w:t xml:space="preserve"> load_model_and_vectoriser, predict_text</w:t>
+        <w:t xml:space="preserve"> load_model_and_vectoriser, predict_text, predict_batch</w:t>
       </w:r>
       <w:r>
         <w:br/>
@@ -3670,9 +4955,140 @@
         </w:rPr>
         <w:t xml:space="preserve">, tfidf, model)</w:t>
       </w:r>
-    </w:p>
-    <w:bookmarkEnd w:id="51"/>
-    <w:bookmarkStart w:id="52" w:name="appendix-b-screenshots-and-diagrams"/>
+      <w:r>
+        <w:br/>
+      </w:r>
+      <w:r>
+        <w:rPr>
+          <w:rStyle w:val="NormalTok"/>
+        </w:rPr>
+        <w:t xml:space="preserve">labels_batch </w:t>
+      </w:r>
+      <w:r>
+        <w:rPr>
+          <w:rStyle w:val="OperatorTok"/>
+        </w:rPr>
+        <w:t xml:space="preserve">=</w:t>
+      </w:r>
+      <w:r>
+        <w:rPr>
+          <w:rStyle w:val="NormalTok"/>
+        </w:rPr>
+        <w:t xml:space="preserve"> predict_batch([</w:t>
+      </w:r>
+      <w:r>
+        <w:rPr>
+          <w:rStyle w:val="StringTok"/>
+        </w:rPr>
+        <w:t xml:space="preserve">"msg1"</w:t>
+      </w:r>
+      <w:r>
+        <w:rPr>
+          <w:rStyle w:val="NormalTok"/>
+        </w:rPr>
+        <w:t xml:space="preserve">, </w:t>
+      </w:r>
+      <w:r>
+        <w:rPr>
+          <w:rStyle w:val="StringTok"/>
+        </w:rPr>
+        <w:t xml:space="preserve">"msg2"</w:t>
+      </w:r>
+      <w:r>
+        <w:rPr>
+          <w:rStyle w:val="NormalTok"/>
+        </w:rPr>
+        <w:t xml:space="preserve">], tfidf, model)</w:t>
+      </w:r>
+    </w:p>
+    <w:p>
+      <w:pPr>
+        <w:pStyle w:val="FirstParagraph"/>
+      </w:pPr>
+      <w:r>
+        <w:rPr>
+          <w:b/>
+          <w:bCs/>
+        </w:rPr>
+        <w:t xml:space="preserve">Chat parsing (multi-format):</w:t>
+      </w:r>
+    </w:p>
+    <w:p>
+      <w:pPr>
+        <w:pStyle w:val="SourceCode"/>
+      </w:pPr>
+      <w:r>
+        <w:rPr>
+          <w:rStyle w:val="ImportTok"/>
+        </w:rPr>
+        <w:t xml:space="preserve">from</w:t>
+      </w:r>
+      <w:r>
+        <w:rPr>
+          <w:rStyle w:val="NormalTok"/>
+        </w:rPr>
+        <w:t xml:space="preserve"> core.chat_parser </w:t>
+      </w:r>
+      <w:r>
+        <w:rPr>
+          <w:rStyle w:val="ImportTok"/>
+        </w:rPr>
+        <w:t xml:space="preserve">import</w:t>
+      </w:r>
+      <w:r>
+        <w:rPr>
+          <w:rStyle w:val="NormalTok"/>
+        </w:rPr>
+        <w:t xml:space="preserve"> parse_chat_from_string</w:t>
+      </w:r>
+      <w:r>
+        <w:br/>
+      </w:r>
+      <w:r>
+        <w:rPr>
+          <w:rStyle w:val="NormalTok"/>
+        </w:rPr>
+        <w:t xml:space="preserve">df </w:t>
+      </w:r>
+      <w:r>
+        <w:rPr>
+          <w:rStyle w:val="OperatorTok"/>
+        </w:rPr>
+        <w:t xml:space="preserve">=</w:t>
+      </w:r>
+      <w:r>
+        <w:rPr>
+          <w:rStyle w:val="NormalTok"/>
+        </w:rPr>
+        <w:t xml:space="preserve"> parse_chat_from_string(chat_text, format_hint</w:t>
+      </w:r>
+      <w:r>
+        <w:rPr>
+          <w:rStyle w:val="OperatorTok"/>
+        </w:rPr>
+        <w:t xml:space="preserve">=</w:t>
+      </w:r>
+      <w:r>
+        <w:rPr>
+          <w:rStyle w:val="StringTok"/>
+        </w:rPr>
+        <w:t xml:space="preserve">"auto"</w:t>
+      </w:r>
+      <w:r>
+        <w:rPr>
+          <w:rStyle w:val="NormalTok"/>
+        </w:rPr>
+        <w:t xml:space="preserve">)  </w:t>
+      </w:r>
+      <w:r>
+        <w:rPr>
+          <w:rStyle w:val="CommentTok"/>
+        </w:rPr>
+        <w:t xml:space="preserve"># or "whatsapp", "telegram", "discord"</w:t>
+      </w:r>
+    </w:p>
+    <w:bookmarkEnd w:id="49"/>
+    <w:bookmarkStart w:id="50" w:name="appendix-b-screenshots-and-diagrams"/>
     <w:p>
       <w:pPr>
         <w:pStyle w:val="Heading3"/>
@@ -3690,45 +5106,45 @@
           <w:i/>
           <w:iCs/>
         </w:rPr>
-        <w:t xml:space="preserve">(Insert screenshots: class distribution, confusion matrix, Streamlit app, etc.)</w:t>
-      </w:r>
-    </w:p>
+        <w:t xml:space="preserve">(Insert screenshots: class distribution, confusion matrix, Streamlit app tabs, sidebar, chat analysis with date filter, per-sender summary.)</w:t>
+      </w:r>
+    </w:p>
+    <w:bookmarkEnd w:id="50"/>
+    <w:bookmarkStart w:id="51" w:name="appendix-c-dataset-format"/>
+    <w:p>
+      <w:pPr>
+        <w:pStyle w:val="Heading3"/>
+      </w:pPr>
+      <w:r>
+        <w:t xml:space="preserve">Appendix C – Dataset Format</w:t>
+      </w:r>
+    </w:p>
+    <w:p>
+      <w:pPr>
+        <w:pStyle w:val="FirstParagraph"/>
+      </w:pPr>
+      <w:r>
+        <w:t xml:space="preserve">See</w:t>
+      </w:r>
+      <w:r>
+        <w:t xml:space="preserve"> </w:t>
+      </w:r>
+      <w:r>
+        <w:rPr>
+          <w:rStyle w:val="VerbatimChar"/>
+        </w:rPr>
+        <w:t xml:space="preserve">dataset/DATASET_FORMAT.md</w:t>
+      </w:r>
+      <w:r>
+        <w:t xml:space="preserve"> </w:t>
+      </w:r>
+      <w:r>
+        <w:t xml:space="preserve">for CSV and chat export specifications.</w:t>
+      </w:r>
+    </w:p>
+    <w:bookmarkEnd w:id="51"/>
     <w:bookmarkEnd w:id="52"/>
-    <w:bookmarkStart w:id="53" w:name="appendix-c-dataset-format"/>
-    <w:p>
-      <w:pPr>
-        <w:pStyle w:val="Heading3"/>
-      </w:pPr>
-      <w:r>
-        <w:t xml:space="preserve">Appendix C – Dataset Format</w:t>
-      </w:r>
-    </w:p>
-    <w:p>
-      <w:pPr>
-        <w:pStyle w:val="FirstParagraph"/>
-      </w:pPr>
-      <w:r>
-        <w:t xml:space="preserve">See</w:t>
-      </w:r>
-      <w:r>
-        <w:t xml:space="preserve"> </w:t>
-      </w:r>
-      <w:r>
-        <w:rPr>
-          <w:rStyle w:val="VerbatimChar"/>
-        </w:rPr>
-        <w:t xml:space="preserve">dataset/DATASET_FORMAT.md</w:t>
-      </w:r>
-      <w:r>
-        <w:t xml:space="preserve"> </w:t>
-      </w:r>
-      <w:r>
-        <w:t xml:space="preserve">for CSV and chat export specifications.</w:t>
-      </w:r>
-    </w:p>
     <w:bookmarkEnd w:id="53"/>
-    <w:bookmarkEnd w:id="54"/>
-    <w:bookmarkEnd w:id="55"/>
     <w:sectPr>
       <w:footnotePr>
         <w:numRestart w:val="eachSect"/>
@@ -4112,6 +5528,18 @@
     <w:abstractNumId w:val="991"/>
   </w:num>
   <w:num w:numId="1010">
+    <w:abstractNumId w:val="991"/>
+  </w:num>
+  <w:num w:numId="1011">
+    <w:abstractNumId w:val="991"/>
+  </w:num>
+  <w:num w:numId="1012">
+    <w:abstractNumId w:val="991"/>
+  </w:num>
+  <w:num w:numId="1013">
+    <w:abstractNumId w:val="991"/>
+  </w:num>
+  <w:num w:numId="1014">
     <w:abstractNumId w:val="99411"/>
     <w:lvlOverride w:ilvl="0">
       <w:startOverride w:val="1"/>
@@ -4141,7 +5569,7 @@
       <w:startOverride w:val="1"/>
     </w:lvlOverride>
   </w:num>
-  <w:num w:numId="1011">
+  <w:num w:numId="1015">
     <w:abstractNumId w:val="99411"/>
     <w:lvlOverride w:ilvl="0">
       <w:startOverride w:val="1"/>
@@ -4171,10 +5599,10 @@
       <w:startOverride w:val="1"/>
     </w:lvlOverride>
   </w:num>
-  <w:num w:numId="1012">
+  <w:num w:numId="1016">
     <w:abstractNumId w:val="991"/>
   </w:num>
-  <w:num w:numId="1013">
+  <w:num w:numId="1017">
     <w:abstractNumId w:val="99411"/>
     <w:lvlOverride w:ilvl="0">
       <w:startOverride w:val="1"/>

</xml_diff>